<commit_message>
docs: CLAUDE.md 상태 업데이트 (HQ L3 ep09, Kids L4 u04), Kids L1~L4 전 레벨 커리큘럼 맵 추가
</commit_message>
<xml_diff>
--- a/HQ_Grammar_Curriculum_Map.docx
+++ b/HQ_Grammar_Curriculum_Map.docx
@@ -6669,30 +6669,3274 @@
           <w:bCs/>
           <w:color w:val="1C3A5E"/>
         </w:rPr>
-        <w:t xml:space="preserve">Hangeul Quest Kids — Level 4  unit01~04 완성 (2026-06-25)</w:t>
-      </w:r>
-    </w:p>
-    <w:p>
-      <w:pPr>
-        <w:spacing w:after="60" w:before="60"/>
-        <w:ind w:left="200"/>
-      </w:pPr>
-      <w:r>
-        <w:rPr>
-          <w:rFonts w:ascii="Arial" w:cs="Arial" w:eastAsia="Arial" w:hAnsi="Arial"/>
-          <w:i/>
-          <w:iCs/>
-          <w:color w:val="555555"/>
-          <w:sz w:val="17"/>
-          <w:szCs w:val="17"/>
-        </w:rPr>
-        <w:t xml:space="preserve">핵심 전략: L3 기초 문법 스토리 활용 + 접속부사 본격 도입, 높임법 preview 시작</w:t>
+        <w:t xml:space="preserve">Hangeul Quest Kids — 레벨별 문법 현황 (Level 4까지 계획)</w:t>
       </w:r>
     </w:p>
     <w:p>
       <w:pPr>
         <w:spacing w:after="160"/>
       </w:pPr>
+    </w:p>
+    <w:p>
+      <w:pPr>
+        <w:pStyle w:val="Heading2"/>
+      </w:pPr>
+      <w:r>
+        <w:rPr>
+          <w:rFonts w:ascii="Arial" w:cs="Arial" w:eastAsia="Arial" w:hAnsi="Arial"/>
+          <w:b/>
+          <w:bCs/>
+          <w:color w:val="1C3A5E"/>
+        </w:rPr>
+        <w:t xml:space="preserve">Kids Level 1 ✅  한글 기초 + 입문 문장</w:t>
+      </w:r>
+    </w:p>
+    <w:tbl>
+      <w:tblPr>
+        <w:tblW w:type="dxa" w:w="10080"/>
+        <w:tblBorders>
+          <w:top w:val="single" w:color="auto" w:sz="4"/>
+          <w:left w:val="single" w:color="auto" w:sz="4"/>
+          <w:bottom w:val="single" w:color="auto" w:sz="4"/>
+          <w:right w:val="single" w:color="auto" w:sz="4"/>
+          <w:insideH w:val="single" w:color="auto" w:sz="4"/>
+          <w:insideV w:val="single" w:color="auto" w:sz="4"/>
+        </w:tblBorders>
+      </w:tblPr>
+      <w:tblGrid>
+        <w:gridCol w:w="700"/>
+        <w:gridCol w:w="2500"/>
+        <w:gridCol w:w="6160"/>
+      </w:tblGrid>
+      <w:tr>
+        <w:trPr>
+          <w:tblHeader/>
+        </w:trPr>
+        <w:tc>
+          <w:tcPr>
+            <w:tcW w:type="dxa" w:w="700"/>
+            <w:tcBorders>
+              <w:top w:val="single" w:color="CCCCCC" w:sz="1"/>
+              <w:left w:val="single" w:color="CCCCCC" w:sz="1"/>
+              <w:bottom w:val="single" w:color="CCCCCC" w:sz="1"/>
+              <w:right w:val="single" w:color="CCCCCC" w:sz="1"/>
+            </w:tcBorders>
+            <w:shd w:fill="1A7A6E" w:val="clear"/>
+            <w:tcMar>
+              <w:top w:type="dxa" w:w="80"/>
+              <w:left w:type="dxa" w:w="120"/>
+              <w:bottom w:type="dxa" w:w="80"/>
+              <w:right w:type="dxa" w:w="120"/>
+            </w:tcMar>
+          </w:tcPr>
+          <w:p>
+            <w:r>
+              <w:rPr>
+                <w:rFonts w:ascii="Arial" w:cs="Arial" w:eastAsia="Arial" w:hAnsi="Arial"/>
+                <w:b/>
+                <w:bCs/>
+                <w:color w:val="FFFFFF"/>
+                <w:sz w:val="18"/>
+                <w:szCs w:val="18"/>
+              </w:rPr>
+              <w:t xml:space="preserve">unit</w:t>
+            </w:r>
+          </w:p>
+        </w:tc>
+        <w:tc>
+          <w:tcPr>
+            <w:tcW w:type="dxa" w:w="2500"/>
+            <w:tcBorders>
+              <w:top w:val="single" w:color="CCCCCC" w:sz="1"/>
+              <w:left w:val="single" w:color="CCCCCC" w:sz="1"/>
+              <w:bottom w:val="single" w:color="CCCCCC" w:sz="1"/>
+              <w:right w:val="single" w:color="CCCCCC" w:sz="1"/>
+            </w:tcBorders>
+            <w:shd w:fill="1A7A6E" w:val="clear"/>
+            <w:tcMar>
+              <w:top w:type="dxa" w:w="80"/>
+              <w:left w:type="dxa" w:w="120"/>
+              <w:bottom w:type="dxa" w:w="80"/>
+              <w:right w:type="dxa" w:w="120"/>
+            </w:tcMar>
+          </w:tcPr>
+          <w:p>
+            <w:r>
+              <w:rPr>
+                <w:rFonts w:ascii="Arial" w:cs="Arial" w:eastAsia="Arial" w:hAnsi="Arial"/>
+                <w:b/>
+                <w:bCs/>
+                <w:color w:val="FFFFFF"/>
+                <w:sz w:val="18"/>
+                <w:szCs w:val="18"/>
+              </w:rPr>
+              <w:t xml:space="preserve">제목</w:t>
+            </w:r>
+          </w:p>
+        </w:tc>
+        <w:tc>
+          <w:tcPr>
+            <w:tcW w:type="dxa" w:w="6160"/>
+            <w:tcBorders>
+              <w:top w:val="single" w:color="CCCCCC" w:sz="1"/>
+              <w:left w:val="single" w:color="CCCCCC" w:sz="1"/>
+              <w:bottom w:val="single" w:color="CCCCCC" w:sz="1"/>
+              <w:right w:val="single" w:color="CCCCCC" w:sz="1"/>
+            </w:tcBorders>
+            <w:shd w:fill="1A7A6E" w:val="clear"/>
+            <w:tcMar>
+              <w:top w:type="dxa" w:w="80"/>
+              <w:left w:type="dxa" w:w="120"/>
+              <w:bottom w:type="dxa" w:w="80"/>
+              <w:right w:type="dxa" w:w="120"/>
+            </w:tcMar>
+          </w:tcPr>
+          <w:p>
+            <w:r>
+              <w:rPr>
+                <w:rFonts w:ascii="Arial" w:cs="Arial" w:eastAsia="Arial" w:hAnsi="Arial"/>
+                <w:b/>
+                <w:bCs/>
+                <w:color w:val="FFFFFF"/>
+                <w:sz w:val="18"/>
+                <w:szCs w:val="18"/>
+              </w:rPr>
+              <w:t xml:space="preserve">핵심 내용</w:t>
+            </w:r>
+          </w:p>
+        </w:tc>
+      </w:tr>
+      <w:tr>
+        <w:trPr>
+          <w:tblHeader w:val="false"/>
+        </w:trPr>
+        <w:tc>
+          <w:tcPr>
+            <w:tcW w:type="dxa" w:w="700"/>
+            <w:tcBorders>
+              <w:top w:val="single" w:color="CCCCCC" w:sz="1"/>
+              <w:left w:val="single" w:color="CCCCCC" w:sz="1"/>
+              <w:bottom w:val="single" w:color="CCCCCC" w:sz="1"/>
+              <w:right w:val="single" w:color="CCCCCC" w:sz="1"/>
+            </w:tcBorders>
+            <w:shd w:fill="E8F5F3" w:val="clear"/>
+            <w:tcMar>
+              <w:top w:type="dxa" w:w="80"/>
+              <w:left w:type="dxa" w:w="120"/>
+              <w:bottom w:type="dxa" w:w="80"/>
+              <w:right w:type="dxa" w:w="120"/>
+            </w:tcMar>
+          </w:tcPr>
+          <w:p>
+            <w:r>
+              <w:rPr>
+                <w:rFonts w:ascii="Arial" w:cs="Arial" w:eastAsia="Arial" w:hAnsi="Arial"/>
+                <w:b w:val="false"/>
+                <w:bCs w:val="false"/>
+                <w:color w:val="222222"/>
+                <w:sz w:val="18"/>
+                <w:szCs w:val="18"/>
+              </w:rPr>
+              <w:t xml:space="preserve">00</w:t>
+            </w:r>
+          </w:p>
+        </w:tc>
+        <w:tc>
+          <w:tcPr>
+            <w:tcW w:type="dxa" w:w="2500"/>
+            <w:tcBorders>
+              <w:top w:val="single" w:color="CCCCCC" w:sz="1"/>
+              <w:left w:val="single" w:color="CCCCCC" w:sz="1"/>
+              <w:bottom w:val="single" w:color="CCCCCC" w:sz="1"/>
+              <w:right w:val="single" w:color="CCCCCC" w:sz="1"/>
+            </w:tcBorders>
+            <w:shd w:fill="FFFFFF" w:val="clear"/>
+            <w:tcMar>
+              <w:top w:type="dxa" w:w="80"/>
+              <w:left w:type="dxa" w:w="120"/>
+              <w:bottom w:type="dxa" w:w="80"/>
+              <w:right w:type="dxa" w:w="120"/>
+            </w:tcMar>
+          </w:tcPr>
+          <w:p>
+            <w:r>
+              <w:rPr>
+                <w:rFonts w:ascii="Arial" w:cs="Arial" w:eastAsia="Arial" w:hAnsi="Arial"/>
+                <w:b w:val="false"/>
+                <w:bCs w:val="false"/>
+                <w:color w:val="222222"/>
+                <w:sz w:val="18"/>
+                <w:szCs w:val="18"/>
+              </w:rPr>
+              <w:t xml:space="preserve">한글 블럭 세계 (예비과)</w:t>
+            </w:r>
+          </w:p>
+        </w:tc>
+        <w:tc>
+          <w:tcPr>
+            <w:tcW w:type="dxa" w:w="6160"/>
+            <w:tcBorders>
+              <w:top w:val="single" w:color="CCCCCC" w:sz="1"/>
+              <w:left w:val="single" w:color="CCCCCC" w:sz="1"/>
+              <w:bottom w:val="single" w:color="CCCCCC" w:sz="1"/>
+              <w:right w:val="single" w:color="CCCCCC" w:sz="1"/>
+            </w:tcBorders>
+            <w:shd w:fill="FFFFFF" w:val="clear"/>
+            <w:tcMar>
+              <w:top w:type="dxa" w:w="80"/>
+              <w:left w:type="dxa" w:w="120"/>
+              <w:bottom w:type="dxa" w:w="80"/>
+              <w:right w:type="dxa" w:w="120"/>
+            </w:tcMar>
+          </w:tcPr>
+          <w:p>
+            <w:r>
+              <w:rPr>
+                <w:rFonts w:ascii="Arial" w:cs="Arial" w:eastAsia="Arial" w:hAnsi="Arial"/>
+                <w:b w:val="false"/>
+                <w:bCs w:val="false"/>
+                <w:color w:val="222222"/>
+                <w:sz w:val="18"/>
+                <w:szCs w:val="18"/>
+              </w:rPr>
+              <w:t xml:space="preserve">자음/모음 개념, 자모 탐험기</w:t>
+            </w:r>
+          </w:p>
+        </w:tc>
+      </w:tr>
+      <w:tr>
+        <w:trPr>
+          <w:tblHeader w:val="false"/>
+        </w:trPr>
+        <w:tc>
+          <w:tcPr>
+            <w:tcW w:type="dxa" w:w="700"/>
+            <w:tcBorders>
+              <w:top w:val="single" w:color="CCCCCC" w:sz="1"/>
+              <w:left w:val="single" w:color="CCCCCC" w:sz="1"/>
+              <w:bottom w:val="single" w:color="CCCCCC" w:sz="1"/>
+              <w:right w:val="single" w:color="CCCCCC" w:sz="1"/>
+            </w:tcBorders>
+            <w:shd w:fill="E8F5F3" w:val="clear"/>
+            <w:tcMar>
+              <w:top w:type="dxa" w:w="80"/>
+              <w:left w:type="dxa" w:w="120"/>
+              <w:bottom w:type="dxa" w:w="80"/>
+              <w:right w:type="dxa" w:w="120"/>
+            </w:tcMar>
+          </w:tcPr>
+          <w:p>
+            <w:r>
+              <w:rPr>
+                <w:rFonts w:ascii="Arial" w:cs="Arial" w:eastAsia="Arial" w:hAnsi="Arial"/>
+                <w:b w:val="false"/>
+                <w:bCs w:val="false"/>
+                <w:color w:val="222222"/>
+                <w:sz w:val="18"/>
+                <w:szCs w:val="18"/>
+              </w:rPr>
+              <w:t xml:space="preserve">01</w:t>
+            </w:r>
+          </w:p>
+        </w:tc>
+        <w:tc>
+          <w:tcPr>
+            <w:tcW w:type="dxa" w:w="2500"/>
+            <w:tcBorders>
+              <w:top w:val="single" w:color="CCCCCC" w:sz="1"/>
+              <w:left w:val="single" w:color="CCCCCC" w:sz="1"/>
+              <w:bottom w:val="single" w:color="CCCCCC" w:sz="1"/>
+              <w:right w:val="single" w:color="CCCCCC" w:sz="1"/>
+            </w:tcBorders>
+            <w:shd w:fill="FFFFFF" w:val="clear"/>
+            <w:tcMar>
+              <w:top w:type="dxa" w:w="80"/>
+              <w:left w:type="dxa" w:w="120"/>
+              <w:bottom w:type="dxa" w:w="80"/>
+              <w:right w:type="dxa" w:w="120"/>
+            </w:tcMar>
+          </w:tcPr>
+          <w:p>
+            <w:r>
+              <w:rPr>
+                <w:rFonts w:ascii="Arial" w:cs="Arial" w:eastAsia="Arial" w:hAnsi="Arial"/>
+                <w:b w:val="false"/>
+                <w:bCs w:val="false"/>
+                <w:color w:val="222222"/>
+                <w:sz w:val="18"/>
+                <w:szCs w:val="18"/>
+              </w:rPr>
+              <w:t xml:space="preserve">기본 모음</w:t>
+            </w:r>
+          </w:p>
+        </w:tc>
+        <w:tc>
+          <w:tcPr>
+            <w:tcW w:type="dxa" w:w="6160"/>
+            <w:tcBorders>
+              <w:top w:val="single" w:color="CCCCCC" w:sz="1"/>
+              <w:left w:val="single" w:color="CCCCCC" w:sz="1"/>
+              <w:bottom w:val="single" w:color="CCCCCC" w:sz="1"/>
+              <w:right w:val="single" w:color="CCCCCC" w:sz="1"/>
+            </w:tcBorders>
+            <w:shd w:fill="FFFFFF" w:val="clear"/>
+            <w:tcMar>
+              <w:top w:type="dxa" w:w="80"/>
+              <w:left w:type="dxa" w:w="120"/>
+              <w:bottom w:type="dxa" w:w="80"/>
+              <w:right w:type="dxa" w:w="120"/>
+            </w:tcMar>
+          </w:tcPr>
+          <w:p>
+            <w:r>
+              <w:rPr>
+                <w:rFonts w:ascii="Arial" w:cs="Arial" w:eastAsia="Arial" w:hAnsi="Arial"/>
+                <w:b w:val="false"/>
+                <w:bCs w:val="false"/>
+                <w:color w:val="222222"/>
+                <w:sz w:val="18"/>
+                <w:szCs w:val="18"/>
+              </w:rPr>
+              <w:t xml:space="preserve">ㅏ ㅓ ㅗ ㅜ ㅡ ㅣ</w:t>
+            </w:r>
+          </w:p>
+        </w:tc>
+      </w:tr>
+      <w:tr>
+        <w:trPr>
+          <w:tblHeader w:val="false"/>
+        </w:trPr>
+        <w:tc>
+          <w:tcPr>
+            <w:tcW w:type="dxa" w:w="700"/>
+            <w:tcBorders>
+              <w:top w:val="single" w:color="CCCCCC" w:sz="1"/>
+              <w:left w:val="single" w:color="CCCCCC" w:sz="1"/>
+              <w:bottom w:val="single" w:color="CCCCCC" w:sz="1"/>
+              <w:right w:val="single" w:color="CCCCCC" w:sz="1"/>
+            </w:tcBorders>
+            <w:shd w:fill="E8F5F3" w:val="clear"/>
+            <w:tcMar>
+              <w:top w:type="dxa" w:w="80"/>
+              <w:left w:type="dxa" w:w="120"/>
+              <w:bottom w:type="dxa" w:w="80"/>
+              <w:right w:type="dxa" w:w="120"/>
+            </w:tcMar>
+          </w:tcPr>
+          <w:p>
+            <w:r>
+              <w:rPr>
+                <w:rFonts w:ascii="Arial" w:cs="Arial" w:eastAsia="Arial" w:hAnsi="Arial"/>
+                <w:b w:val="false"/>
+                <w:bCs w:val="false"/>
+                <w:color w:val="222222"/>
+                <w:sz w:val="18"/>
+                <w:szCs w:val="18"/>
+              </w:rPr>
+              <w:t xml:space="preserve">02</w:t>
+            </w:r>
+          </w:p>
+        </w:tc>
+        <w:tc>
+          <w:tcPr>
+            <w:tcW w:type="dxa" w:w="2500"/>
+            <w:tcBorders>
+              <w:top w:val="single" w:color="CCCCCC" w:sz="1"/>
+              <w:left w:val="single" w:color="CCCCCC" w:sz="1"/>
+              <w:bottom w:val="single" w:color="CCCCCC" w:sz="1"/>
+              <w:right w:val="single" w:color="CCCCCC" w:sz="1"/>
+            </w:tcBorders>
+            <w:shd w:fill="FFFFFF" w:val="clear"/>
+            <w:tcMar>
+              <w:top w:type="dxa" w:w="80"/>
+              <w:left w:type="dxa" w:w="120"/>
+              <w:bottom w:type="dxa" w:w="80"/>
+              <w:right w:type="dxa" w:w="120"/>
+            </w:tcMar>
+          </w:tcPr>
+          <w:p>
+            <w:r>
+              <w:rPr>
+                <w:rFonts w:ascii="Arial" w:cs="Arial" w:eastAsia="Arial" w:hAnsi="Arial"/>
+                <w:b w:val="false"/>
+                <w:bCs w:val="false"/>
+                <w:color w:val="222222"/>
+                <w:sz w:val="18"/>
+                <w:szCs w:val="18"/>
+              </w:rPr>
+              <w:t xml:space="preserve">복합 모음</w:t>
+            </w:r>
+          </w:p>
+        </w:tc>
+        <w:tc>
+          <w:tcPr>
+            <w:tcW w:type="dxa" w:w="6160"/>
+            <w:tcBorders>
+              <w:top w:val="single" w:color="CCCCCC" w:sz="1"/>
+              <w:left w:val="single" w:color="CCCCCC" w:sz="1"/>
+              <w:bottom w:val="single" w:color="CCCCCC" w:sz="1"/>
+              <w:right w:val="single" w:color="CCCCCC" w:sz="1"/>
+            </w:tcBorders>
+            <w:shd w:fill="FFFFFF" w:val="clear"/>
+            <w:tcMar>
+              <w:top w:type="dxa" w:w="80"/>
+              <w:left w:type="dxa" w:w="120"/>
+              <w:bottom w:type="dxa" w:w="80"/>
+              <w:right w:type="dxa" w:w="120"/>
+            </w:tcMar>
+          </w:tcPr>
+          <w:p>
+            <w:r>
+              <w:rPr>
+                <w:rFonts w:ascii="Arial" w:cs="Arial" w:eastAsia="Arial" w:hAnsi="Arial"/>
+                <w:b w:val="false"/>
+                <w:bCs w:val="false"/>
+                <w:color w:val="222222"/>
+                <w:sz w:val="18"/>
+                <w:szCs w:val="18"/>
+              </w:rPr>
+              <w:t xml:space="preserve">ㅐ ㅔ ㅘ ㅙ ㅚ ㅝ ㅞ ㅟ ㅢ</w:t>
+            </w:r>
+          </w:p>
+        </w:tc>
+      </w:tr>
+      <w:tr>
+        <w:trPr>
+          <w:tblHeader w:val="false"/>
+        </w:trPr>
+        <w:tc>
+          <w:tcPr>
+            <w:tcW w:type="dxa" w:w="700"/>
+            <w:tcBorders>
+              <w:top w:val="single" w:color="CCCCCC" w:sz="1"/>
+              <w:left w:val="single" w:color="CCCCCC" w:sz="1"/>
+              <w:bottom w:val="single" w:color="CCCCCC" w:sz="1"/>
+              <w:right w:val="single" w:color="CCCCCC" w:sz="1"/>
+            </w:tcBorders>
+            <w:shd w:fill="E8F5F3" w:val="clear"/>
+            <w:tcMar>
+              <w:top w:type="dxa" w:w="80"/>
+              <w:left w:type="dxa" w:w="120"/>
+              <w:bottom w:type="dxa" w:w="80"/>
+              <w:right w:type="dxa" w:w="120"/>
+            </w:tcMar>
+          </w:tcPr>
+          <w:p>
+            <w:r>
+              <w:rPr>
+                <w:rFonts w:ascii="Arial" w:cs="Arial" w:eastAsia="Arial" w:hAnsi="Arial"/>
+                <w:b w:val="false"/>
+                <w:bCs w:val="false"/>
+                <w:color w:val="222222"/>
+                <w:sz w:val="18"/>
+                <w:szCs w:val="18"/>
+              </w:rPr>
+              <w:t xml:space="preserve">03</w:t>
+            </w:r>
+          </w:p>
+        </w:tc>
+        <w:tc>
+          <w:tcPr>
+            <w:tcW w:type="dxa" w:w="2500"/>
+            <w:tcBorders>
+              <w:top w:val="single" w:color="CCCCCC" w:sz="1"/>
+              <w:left w:val="single" w:color="CCCCCC" w:sz="1"/>
+              <w:bottom w:val="single" w:color="CCCCCC" w:sz="1"/>
+              <w:right w:val="single" w:color="CCCCCC" w:sz="1"/>
+            </w:tcBorders>
+            <w:shd w:fill="FFFFFF" w:val="clear"/>
+            <w:tcMar>
+              <w:top w:type="dxa" w:w="80"/>
+              <w:left w:type="dxa" w:w="120"/>
+              <w:bottom w:type="dxa" w:w="80"/>
+              <w:right w:type="dxa" w:w="120"/>
+            </w:tcMar>
+          </w:tcPr>
+          <w:p>
+            <w:r>
+              <w:rPr>
+                <w:rFonts w:ascii="Arial" w:cs="Arial" w:eastAsia="Arial" w:hAnsi="Arial"/>
+                <w:b w:val="false"/>
+                <w:bCs w:val="false"/>
+                <w:color w:val="222222"/>
+                <w:sz w:val="18"/>
+                <w:szCs w:val="18"/>
+              </w:rPr>
+              <w:t xml:space="preserve">기본 자음</w:t>
+            </w:r>
+          </w:p>
+        </w:tc>
+        <w:tc>
+          <w:tcPr>
+            <w:tcW w:type="dxa" w:w="6160"/>
+            <w:tcBorders>
+              <w:top w:val="single" w:color="CCCCCC" w:sz="1"/>
+              <w:left w:val="single" w:color="CCCCCC" w:sz="1"/>
+              <w:bottom w:val="single" w:color="CCCCCC" w:sz="1"/>
+              <w:right w:val="single" w:color="CCCCCC" w:sz="1"/>
+            </w:tcBorders>
+            <w:shd w:fill="FFFFFF" w:val="clear"/>
+            <w:tcMar>
+              <w:top w:type="dxa" w:w="80"/>
+              <w:left w:type="dxa" w:w="120"/>
+              <w:bottom w:type="dxa" w:w="80"/>
+              <w:right w:type="dxa" w:w="120"/>
+            </w:tcMar>
+          </w:tcPr>
+          <w:p>
+            <w:r>
+              <w:rPr>
+                <w:rFonts w:ascii="Arial" w:cs="Arial" w:eastAsia="Arial" w:hAnsi="Arial"/>
+                <w:b w:val="false"/>
+                <w:bCs w:val="false"/>
+                <w:color w:val="222222"/>
+                <w:sz w:val="18"/>
+                <w:szCs w:val="18"/>
+              </w:rPr>
+              <w:t xml:space="preserve">ㄱ ㄴ ㄷ ㄹ ㅁ ㅂ ㅅ ㅇ ㅎ 등</w:t>
+            </w:r>
+          </w:p>
+        </w:tc>
+      </w:tr>
+      <w:tr>
+        <w:trPr>
+          <w:tblHeader w:val="false"/>
+        </w:trPr>
+        <w:tc>
+          <w:tcPr>
+            <w:tcW w:type="dxa" w:w="700"/>
+            <w:tcBorders>
+              <w:top w:val="single" w:color="CCCCCC" w:sz="1"/>
+              <w:left w:val="single" w:color="CCCCCC" w:sz="1"/>
+              <w:bottom w:val="single" w:color="CCCCCC" w:sz="1"/>
+              <w:right w:val="single" w:color="CCCCCC" w:sz="1"/>
+            </w:tcBorders>
+            <w:shd w:fill="E8F5F3" w:val="clear"/>
+            <w:tcMar>
+              <w:top w:type="dxa" w:w="80"/>
+              <w:left w:type="dxa" w:w="120"/>
+              <w:bottom w:type="dxa" w:w="80"/>
+              <w:right w:type="dxa" w:w="120"/>
+            </w:tcMar>
+          </w:tcPr>
+          <w:p>
+            <w:r>
+              <w:rPr>
+                <w:rFonts w:ascii="Arial" w:cs="Arial" w:eastAsia="Arial" w:hAnsi="Arial"/>
+                <w:b w:val="false"/>
+                <w:bCs w:val="false"/>
+                <w:color w:val="222222"/>
+                <w:sz w:val="18"/>
+                <w:szCs w:val="18"/>
+              </w:rPr>
+              <w:t xml:space="preserve">04</w:t>
+            </w:r>
+          </w:p>
+        </w:tc>
+        <w:tc>
+          <w:tcPr>
+            <w:tcW w:type="dxa" w:w="2500"/>
+            <w:tcBorders>
+              <w:top w:val="single" w:color="CCCCCC" w:sz="1"/>
+              <w:left w:val="single" w:color="CCCCCC" w:sz="1"/>
+              <w:bottom w:val="single" w:color="CCCCCC" w:sz="1"/>
+              <w:right w:val="single" w:color="CCCCCC" w:sz="1"/>
+            </w:tcBorders>
+            <w:shd w:fill="FFFFFF" w:val="clear"/>
+            <w:tcMar>
+              <w:top w:type="dxa" w:w="80"/>
+              <w:left w:type="dxa" w:w="120"/>
+              <w:bottom w:type="dxa" w:w="80"/>
+              <w:right w:type="dxa" w:w="120"/>
+            </w:tcMar>
+          </w:tcPr>
+          <w:p>
+            <w:r>
+              <w:rPr>
+                <w:rFonts w:ascii="Arial" w:cs="Arial" w:eastAsia="Arial" w:hAnsi="Arial"/>
+                <w:b w:val="false"/>
+                <w:bCs w:val="false"/>
+                <w:color w:val="222222"/>
+                <w:sz w:val="18"/>
+                <w:szCs w:val="18"/>
+              </w:rPr>
+              <w:t xml:space="preserve">쌍자음과 센소리</w:t>
+            </w:r>
+          </w:p>
+        </w:tc>
+        <w:tc>
+          <w:tcPr>
+            <w:tcW w:type="dxa" w:w="6160"/>
+            <w:tcBorders>
+              <w:top w:val="single" w:color="CCCCCC" w:sz="1"/>
+              <w:left w:val="single" w:color="CCCCCC" w:sz="1"/>
+              <w:bottom w:val="single" w:color="CCCCCC" w:sz="1"/>
+              <w:right w:val="single" w:color="CCCCCC" w:sz="1"/>
+            </w:tcBorders>
+            <w:shd w:fill="FFFFFF" w:val="clear"/>
+            <w:tcMar>
+              <w:top w:type="dxa" w:w="80"/>
+              <w:left w:type="dxa" w:w="120"/>
+              <w:bottom w:type="dxa" w:w="80"/>
+              <w:right w:type="dxa" w:w="120"/>
+            </w:tcMar>
+          </w:tcPr>
+          <w:p>
+            <w:r>
+              <w:rPr>
+                <w:rFonts w:ascii="Arial" w:cs="Arial" w:eastAsia="Arial" w:hAnsi="Arial"/>
+                <w:b w:val="false"/>
+                <w:bCs w:val="false"/>
+                <w:color w:val="222222"/>
+                <w:sz w:val="18"/>
+                <w:szCs w:val="18"/>
+              </w:rPr>
+              <w:t xml:space="preserve">ㄲ ㄸ ㅃ ㅆ ㅉ / ㅋ ㅌ ㅍ ㅊ</w:t>
+            </w:r>
+          </w:p>
+        </w:tc>
+      </w:tr>
+      <w:tr>
+        <w:trPr>
+          <w:tblHeader w:val="false"/>
+        </w:trPr>
+        <w:tc>
+          <w:tcPr>
+            <w:tcW w:type="dxa" w:w="700"/>
+            <w:tcBorders>
+              <w:top w:val="single" w:color="CCCCCC" w:sz="1"/>
+              <w:left w:val="single" w:color="CCCCCC" w:sz="1"/>
+              <w:bottom w:val="single" w:color="CCCCCC" w:sz="1"/>
+              <w:right w:val="single" w:color="CCCCCC" w:sz="1"/>
+            </w:tcBorders>
+            <w:shd w:fill="E8F5F3" w:val="clear"/>
+            <w:tcMar>
+              <w:top w:type="dxa" w:w="80"/>
+              <w:left w:type="dxa" w:w="120"/>
+              <w:bottom w:type="dxa" w:w="80"/>
+              <w:right w:type="dxa" w:w="120"/>
+            </w:tcMar>
+          </w:tcPr>
+          <w:p>
+            <w:r>
+              <w:rPr>
+                <w:rFonts w:ascii="Arial" w:cs="Arial" w:eastAsia="Arial" w:hAnsi="Arial"/>
+                <w:b w:val="false"/>
+                <w:bCs w:val="false"/>
+                <w:color w:val="222222"/>
+                <w:sz w:val="18"/>
+                <w:szCs w:val="18"/>
+              </w:rPr>
+              <w:t xml:space="preserve">05</w:t>
+            </w:r>
+          </w:p>
+        </w:tc>
+        <w:tc>
+          <w:tcPr>
+            <w:tcW w:type="dxa" w:w="2500"/>
+            <w:tcBorders>
+              <w:top w:val="single" w:color="CCCCCC" w:sz="1"/>
+              <w:left w:val="single" w:color="CCCCCC" w:sz="1"/>
+              <w:bottom w:val="single" w:color="CCCCCC" w:sz="1"/>
+              <w:right w:val="single" w:color="CCCCCC" w:sz="1"/>
+            </w:tcBorders>
+            <w:shd w:fill="FFFFFF" w:val="clear"/>
+            <w:tcMar>
+              <w:top w:type="dxa" w:w="80"/>
+              <w:left w:type="dxa" w:w="120"/>
+              <w:bottom w:type="dxa" w:w="80"/>
+              <w:right w:type="dxa" w:w="120"/>
+            </w:tcMar>
+          </w:tcPr>
+          <w:p>
+            <w:r>
+              <w:rPr>
+                <w:rFonts w:ascii="Arial" w:cs="Arial" w:eastAsia="Arial" w:hAnsi="Arial"/>
+                <w:b w:val="false"/>
+                <w:bCs w:val="false"/>
+                <w:color w:val="222222"/>
+                <w:sz w:val="18"/>
+                <w:szCs w:val="18"/>
+              </w:rPr>
+              <w:t xml:space="preserve">블럭 조합</w:t>
+            </w:r>
+          </w:p>
+        </w:tc>
+        <w:tc>
+          <w:tcPr>
+            <w:tcW w:type="dxa" w:w="6160"/>
+            <w:tcBorders>
+              <w:top w:val="single" w:color="CCCCCC" w:sz="1"/>
+              <w:left w:val="single" w:color="CCCCCC" w:sz="1"/>
+              <w:bottom w:val="single" w:color="CCCCCC" w:sz="1"/>
+              <w:right w:val="single" w:color="CCCCCC" w:sz="1"/>
+            </w:tcBorders>
+            <w:shd w:fill="FFFFFF" w:val="clear"/>
+            <w:tcMar>
+              <w:top w:type="dxa" w:w="80"/>
+              <w:left w:type="dxa" w:w="120"/>
+              <w:bottom w:type="dxa" w:w="80"/>
+              <w:right w:type="dxa" w:w="120"/>
+            </w:tcMar>
+          </w:tcPr>
+          <w:p>
+            <w:r>
+              <w:rPr>
+                <w:rFonts w:ascii="Arial" w:cs="Arial" w:eastAsia="Arial" w:hAnsi="Arial"/>
+                <w:b w:val="false"/>
+                <w:bCs w:val="false"/>
+                <w:color w:val="222222"/>
+                <w:sz w:val="18"/>
+                <w:szCs w:val="18"/>
+              </w:rPr>
+              <w:t xml:space="preserve">자음+모음 결합, 음절 만들기</w:t>
+            </w:r>
+          </w:p>
+        </w:tc>
+      </w:tr>
+      <w:tr>
+        <w:trPr>
+          <w:tblHeader w:val="false"/>
+        </w:trPr>
+        <w:tc>
+          <w:tcPr>
+            <w:tcW w:type="dxa" w:w="700"/>
+            <w:tcBorders>
+              <w:top w:val="single" w:color="CCCCCC" w:sz="1"/>
+              <w:left w:val="single" w:color="CCCCCC" w:sz="1"/>
+              <w:bottom w:val="single" w:color="CCCCCC" w:sz="1"/>
+              <w:right w:val="single" w:color="CCCCCC" w:sz="1"/>
+            </w:tcBorders>
+            <w:shd w:fill="E8F5F3" w:val="clear"/>
+            <w:tcMar>
+              <w:top w:type="dxa" w:w="80"/>
+              <w:left w:type="dxa" w:w="120"/>
+              <w:bottom w:type="dxa" w:w="80"/>
+              <w:right w:type="dxa" w:w="120"/>
+            </w:tcMar>
+          </w:tcPr>
+          <w:p>
+            <w:r>
+              <w:rPr>
+                <w:rFonts w:ascii="Arial" w:cs="Arial" w:eastAsia="Arial" w:hAnsi="Arial"/>
+                <w:b w:val="false"/>
+                <w:bCs w:val="false"/>
+                <w:color w:val="222222"/>
+                <w:sz w:val="18"/>
+                <w:szCs w:val="18"/>
+              </w:rPr>
+              <w:t xml:space="preserve">06</w:t>
+            </w:r>
+          </w:p>
+        </w:tc>
+        <w:tc>
+          <w:tcPr>
+            <w:tcW w:type="dxa" w:w="2500"/>
+            <w:tcBorders>
+              <w:top w:val="single" w:color="CCCCCC" w:sz="1"/>
+              <w:left w:val="single" w:color="CCCCCC" w:sz="1"/>
+              <w:bottom w:val="single" w:color="CCCCCC" w:sz="1"/>
+              <w:right w:val="single" w:color="CCCCCC" w:sz="1"/>
+            </w:tcBorders>
+            <w:shd w:fill="FFFFFF" w:val="clear"/>
+            <w:tcMar>
+              <w:top w:type="dxa" w:w="80"/>
+              <w:left w:type="dxa" w:w="120"/>
+              <w:bottom w:type="dxa" w:w="80"/>
+              <w:right w:type="dxa" w:w="120"/>
+            </w:tcMar>
+          </w:tcPr>
+          <w:p>
+            <w:r>
+              <w:rPr>
+                <w:rFonts w:ascii="Arial" w:cs="Arial" w:eastAsia="Arial" w:hAnsi="Arial"/>
+                <w:b w:val="false"/>
+                <w:bCs w:val="false"/>
+                <w:color w:val="222222"/>
+                <w:sz w:val="18"/>
+                <w:szCs w:val="18"/>
+              </w:rPr>
+              <w:t xml:space="preserve">받침</w:t>
+            </w:r>
+          </w:p>
+        </w:tc>
+        <w:tc>
+          <w:tcPr>
+            <w:tcW w:type="dxa" w:w="6160"/>
+            <w:tcBorders>
+              <w:top w:val="single" w:color="CCCCCC" w:sz="1"/>
+              <w:left w:val="single" w:color="CCCCCC" w:sz="1"/>
+              <w:bottom w:val="single" w:color="CCCCCC" w:sz="1"/>
+              <w:right w:val="single" w:color="CCCCCC" w:sz="1"/>
+            </w:tcBorders>
+            <w:shd w:fill="FFFFFF" w:val="clear"/>
+            <w:tcMar>
+              <w:top w:type="dxa" w:w="80"/>
+              <w:left w:type="dxa" w:w="120"/>
+              <w:bottom w:type="dxa" w:w="80"/>
+              <w:right w:type="dxa" w:w="120"/>
+            </w:tcMar>
+          </w:tcPr>
+          <w:p>
+            <w:r>
+              <w:rPr>
+                <w:rFonts w:ascii="Arial" w:cs="Arial" w:eastAsia="Arial" w:hAnsi="Arial"/>
+                <w:b w:val="false"/>
+                <w:bCs w:val="false"/>
+                <w:color w:val="222222"/>
+                <w:sz w:val="18"/>
+                <w:szCs w:val="18"/>
+              </w:rPr>
+              <w:t xml:space="preserve">7대표음, 받침 조합</w:t>
+            </w:r>
+          </w:p>
+        </w:tc>
+      </w:tr>
+      <w:tr>
+        <w:trPr>
+          <w:tblHeader w:val="false"/>
+        </w:trPr>
+        <w:tc>
+          <w:tcPr>
+            <w:tcW w:type="dxa" w:w="700"/>
+            <w:tcBorders>
+              <w:top w:val="single" w:color="CCCCCC" w:sz="1"/>
+              <w:left w:val="single" w:color="CCCCCC" w:sz="1"/>
+              <w:bottom w:val="single" w:color="CCCCCC" w:sz="1"/>
+              <w:right w:val="single" w:color="CCCCCC" w:sz="1"/>
+            </w:tcBorders>
+            <w:shd w:fill="E8F5F3" w:val="clear"/>
+            <w:tcMar>
+              <w:top w:type="dxa" w:w="80"/>
+              <w:left w:type="dxa" w:w="120"/>
+              <w:bottom w:type="dxa" w:w="80"/>
+              <w:right w:type="dxa" w:w="120"/>
+            </w:tcMar>
+          </w:tcPr>
+          <w:p>
+            <w:r>
+              <w:rPr>
+                <w:rFonts w:ascii="Arial" w:cs="Arial" w:eastAsia="Arial" w:hAnsi="Arial"/>
+                <w:b w:val="false"/>
+                <w:bCs w:val="false"/>
+                <w:color w:val="222222"/>
+                <w:sz w:val="18"/>
+                <w:szCs w:val="18"/>
+              </w:rPr>
+              <w:t xml:space="preserve">07</w:t>
+            </w:r>
+          </w:p>
+        </w:tc>
+        <w:tc>
+          <w:tcPr>
+            <w:tcW w:type="dxa" w:w="2500"/>
+            <w:tcBorders>
+              <w:top w:val="single" w:color="CCCCCC" w:sz="1"/>
+              <w:left w:val="single" w:color="CCCCCC" w:sz="1"/>
+              <w:bottom w:val="single" w:color="CCCCCC" w:sz="1"/>
+              <w:right w:val="single" w:color="CCCCCC" w:sz="1"/>
+            </w:tcBorders>
+            <w:shd w:fill="FFFFFF" w:val="clear"/>
+            <w:tcMar>
+              <w:top w:type="dxa" w:w="80"/>
+              <w:left w:type="dxa" w:w="120"/>
+              <w:bottom w:type="dxa" w:w="80"/>
+              <w:right w:type="dxa" w:w="120"/>
+            </w:tcMar>
+          </w:tcPr>
+          <w:p>
+            <w:r>
+              <w:rPr>
+                <w:rFonts w:ascii="Arial" w:cs="Arial" w:eastAsia="Arial" w:hAnsi="Arial"/>
+                <w:b w:val="false"/>
+                <w:bCs w:val="false"/>
+                <w:color w:val="222222"/>
+                <w:sz w:val="18"/>
+                <w:szCs w:val="18"/>
+              </w:rPr>
+              <w:t xml:space="preserve">안녕하세요?</w:t>
+            </w:r>
+          </w:p>
+        </w:tc>
+        <w:tc>
+          <w:tcPr>
+            <w:tcW w:type="dxa" w:w="6160"/>
+            <w:tcBorders>
+              <w:top w:val="single" w:color="CCCCCC" w:sz="1"/>
+              <w:left w:val="single" w:color="CCCCCC" w:sz="1"/>
+              <w:bottom w:val="single" w:color="CCCCCC" w:sz="1"/>
+              <w:right w:val="single" w:color="CCCCCC" w:sz="1"/>
+            </w:tcBorders>
+            <w:shd w:fill="FFFFFF" w:val="clear"/>
+            <w:tcMar>
+              <w:top w:type="dxa" w:w="80"/>
+              <w:left w:type="dxa" w:w="120"/>
+              <w:bottom w:type="dxa" w:w="80"/>
+              <w:right w:type="dxa" w:w="120"/>
+            </w:tcMar>
+          </w:tcPr>
+          <w:p>
+            <w:r>
+              <w:rPr>
+                <w:rFonts w:ascii="Arial" w:cs="Arial" w:eastAsia="Arial" w:hAnsi="Arial"/>
+                <w:b w:val="false"/>
+                <w:bCs w:val="false"/>
+                <w:color w:val="222222"/>
+                <w:sz w:val="18"/>
+                <w:szCs w:val="18"/>
+              </w:rPr>
+              <w:t xml:space="preserve">N이에요/예요, 인사 표현</w:t>
+            </w:r>
+          </w:p>
+        </w:tc>
+      </w:tr>
+      <w:tr>
+        <w:trPr>
+          <w:tblHeader w:val="false"/>
+        </w:trPr>
+        <w:tc>
+          <w:tcPr>
+            <w:tcW w:type="dxa" w:w="700"/>
+            <w:tcBorders>
+              <w:top w:val="single" w:color="CCCCCC" w:sz="1"/>
+              <w:left w:val="single" w:color="CCCCCC" w:sz="1"/>
+              <w:bottom w:val="single" w:color="CCCCCC" w:sz="1"/>
+              <w:right w:val="single" w:color="CCCCCC" w:sz="1"/>
+            </w:tcBorders>
+            <w:shd w:fill="E8F5F3" w:val="clear"/>
+            <w:tcMar>
+              <w:top w:type="dxa" w:w="80"/>
+              <w:left w:type="dxa" w:w="120"/>
+              <w:bottom w:type="dxa" w:w="80"/>
+              <w:right w:type="dxa" w:w="120"/>
+            </w:tcMar>
+          </w:tcPr>
+          <w:p>
+            <w:r>
+              <w:rPr>
+                <w:rFonts w:ascii="Arial" w:cs="Arial" w:eastAsia="Arial" w:hAnsi="Arial"/>
+                <w:b w:val="false"/>
+                <w:bCs w:val="false"/>
+                <w:color w:val="222222"/>
+                <w:sz w:val="18"/>
+                <w:szCs w:val="18"/>
+              </w:rPr>
+              <w:t xml:space="preserve">08</w:t>
+            </w:r>
+          </w:p>
+        </w:tc>
+        <w:tc>
+          <w:tcPr>
+            <w:tcW w:type="dxa" w:w="2500"/>
+            <w:tcBorders>
+              <w:top w:val="single" w:color="CCCCCC" w:sz="1"/>
+              <w:left w:val="single" w:color="CCCCCC" w:sz="1"/>
+              <w:bottom w:val="single" w:color="CCCCCC" w:sz="1"/>
+              <w:right w:val="single" w:color="CCCCCC" w:sz="1"/>
+            </w:tcBorders>
+            <w:shd w:fill="FFFFFF" w:val="clear"/>
+            <w:tcMar>
+              <w:top w:type="dxa" w:w="80"/>
+              <w:left w:type="dxa" w:w="120"/>
+              <w:bottom w:type="dxa" w:w="80"/>
+              <w:right w:type="dxa" w:w="120"/>
+            </w:tcMar>
+          </w:tcPr>
+          <w:p>
+            <w:r>
+              <w:rPr>
+                <w:rFonts w:ascii="Arial" w:cs="Arial" w:eastAsia="Arial" w:hAnsi="Arial"/>
+                <w:b w:val="false"/>
+                <w:bCs w:val="false"/>
+                <w:color w:val="222222"/>
+                <w:sz w:val="18"/>
+                <w:szCs w:val="18"/>
+              </w:rPr>
+              <w:t xml:space="preserve">이게 뭐예요?</w:t>
+            </w:r>
+          </w:p>
+        </w:tc>
+        <w:tc>
+          <w:tcPr>
+            <w:tcW w:type="dxa" w:w="6160"/>
+            <w:tcBorders>
+              <w:top w:val="single" w:color="CCCCCC" w:sz="1"/>
+              <w:left w:val="single" w:color="CCCCCC" w:sz="1"/>
+              <w:bottom w:val="single" w:color="CCCCCC" w:sz="1"/>
+              <w:right w:val="single" w:color="CCCCCC" w:sz="1"/>
+            </w:tcBorders>
+            <w:shd w:fill="FFFFFF" w:val="clear"/>
+            <w:tcMar>
+              <w:top w:type="dxa" w:w="80"/>
+              <w:left w:type="dxa" w:w="120"/>
+              <w:bottom w:type="dxa" w:w="80"/>
+              <w:right w:type="dxa" w:w="120"/>
+            </w:tcMar>
+          </w:tcPr>
+          <w:p>
+            <w:r>
+              <w:rPr>
+                <w:rFonts w:ascii="Arial" w:cs="Arial" w:eastAsia="Arial" w:hAnsi="Arial"/>
+                <w:b w:val="false"/>
+                <w:bCs w:val="false"/>
+                <w:color w:val="222222"/>
+                <w:sz w:val="18"/>
+                <w:szCs w:val="18"/>
+              </w:rPr>
+              <w:t xml:space="preserve">이게/저게, 교실 어휘</w:t>
+            </w:r>
+          </w:p>
+        </w:tc>
+      </w:tr>
+      <w:tr>
+        <w:trPr>
+          <w:tblHeader w:val="false"/>
+        </w:trPr>
+        <w:tc>
+          <w:tcPr>
+            <w:tcW w:type="dxa" w:w="700"/>
+            <w:tcBorders>
+              <w:top w:val="single" w:color="CCCCCC" w:sz="1"/>
+              <w:left w:val="single" w:color="CCCCCC" w:sz="1"/>
+              <w:bottom w:val="single" w:color="CCCCCC" w:sz="1"/>
+              <w:right w:val="single" w:color="CCCCCC" w:sz="1"/>
+            </w:tcBorders>
+            <w:shd w:fill="E8F5F3" w:val="clear"/>
+            <w:tcMar>
+              <w:top w:type="dxa" w:w="80"/>
+              <w:left w:type="dxa" w:w="120"/>
+              <w:bottom w:type="dxa" w:w="80"/>
+              <w:right w:type="dxa" w:w="120"/>
+            </w:tcMar>
+          </w:tcPr>
+          <w:p>
+            <w:r>
+              <w:rPr>
+                <w:rFonts w:ascii="Arial" w:cs="Arial" w:eastAsia="Arial" w:hAnsi="Arial"/>
+                <w:b w:val="false"/>
+                <w:bCs w:val="false"/>
+                <w:color w:val="222222"/>
+                <w:sz w:val="18"/>
+                <w:szCs w:val="18"/>
+              </w:rPr>
+              <w:t xml:space="preserve">09</w:t>
+            </w:r>
+          </w:p>
+        </w:tc>
+        <w:tc>
+          <w:tcPr>
+            <w:tcW w:type="dxa" w:w="2500"/>
+            <w:tcBorders>
+              <w:top w:val="single" w:color="CCCCCC" w:sz="1"/>
+              <w:left w:val="single" w:color="CCCCCC" w:sz="1"/>
+              <w:bottom w:val="single" w:color="CCCCCC" w:sz="1"/>
+              <w:right w:val="single" w:color="CCCCCC" w:sz="1"/>
+            </w:tcBorders>
+            <w:shd w:fill="FFFFFF" w:val="clear"/>
+            <w:tcMar>
+              <w:top w:type="dxa" w:w="80"/>
+              <w:left w:type="dxa" w:w="120"/>
+              <w:bottom w:type="dxa" w:w="80"/>
+              <w:right w:type="dxa" w:w="120"/>
+            </w:tcMar>
+          </w:tcPr>
+          <w:p>
+            <w:r>
+              <w:rPr>
+                <w:rFonts w:ascii="Arial" w:cs="Arial" w:eastAsia="Arial" w:hAnsi="Arial"/>
+                <w:b w:val="false"/>
+                <w:bCs w:val="false"/>
+                <w:color w:val="222222"/>
+                <w:sz w:val="18"/>
+                <w:szCs w:val="18"/>
+              </w:rPr>
+              <w:t xml:space="preserve">있어요 / 없어요</w:t>
+            </w:r>
+          </w:p>
+        </w:tc>
+        <w:tc>
+          <w:tcPr>
+            <w:tcW w:type="dxa" w:w="6160"/>
+            <w:tcBorders>
+              <w:top w:val="single" w:color="CCCCCC" w:sz="1"/>
+              <w:left w:val="single" w:color="CCCCCC" w:sz="1"/>
+              <w:bottom w:val="single" w:color="CCCCCC" w:sz="1"/>
+              <w:right w:val="single" w:color="CCCCCC" w:sz="1"/>
+            </w:tcBorders>
+            <w:shd w:fill="FFFFFF" w:val="clear"/>
+            <w:tcMar>
+              <w:top w:type="dxa" w:w="80"/>
+              <w:left w:type="dxa" w:w="120"/>
+              <w:bottom w:type="dxa" w:w="80"/>
+              <w:right w:type="dxa" w:w="120"/>
+            </w:tcMar>
+          </w:tcPr>
+          <w:p>
+            <w:r>
+              <w:rPr>
+                <w:rFonts w:ascii="Arial" w:cs="Arial" w:eastAsia="Arial" w:hAnsi="Arial"/>
+                <w:b w:val="false"/>
+                <w:bCs w:val="false"/>
+                <w:color w:val="222222"/>
+                <w:sz w:val="18"/>
+                <w:szCs w:val="18"/>
+              </w:rPr>
+              <w:t xml:space="preserve">N이 있어요/없어요</w:t>
+            </w:r>
+          </w:p>
+        </w:tc>
+      </w:tr>
+    </w:tbl>
+    <w:p>
+      <w:pPr>
+        <w:spacing w:after="160"/>
+      </w:pPr>
+    </w:p>
+    <w:p>
+      <w:pPr>
+        <w:pStyle w:val="Heading2"/>
+      </w:pPr>
+      <w:r>
+        <w:rPr>
+          <w:rFonts w:ascii="Arial" w:cs="Arial" w:eastAsia="Arial" w:hAnsi="Arial"/>
+          <w:b/>
+          <w:bCs/>
+          <w:color w:val="1C3A5E"/>
+        </w:rPr>
+        <w:t xml:space="preserve">Kids Level 2 ✅  기본 조사 + 일상 표현</w:t>
+      </w:r>
+    </w:p>
+    <w:tbl>
+      <w:tblPr>
+        <w:tblW w:type="dxa" w:w="10080"/>
+        <w:tblBorders>
+          <w:top w:val="single" w:color="auto" w:sz="4"/>
+          <w:left w:val="single" w:color="auto" w:sz="4"/>
+          <w:bottom w:val="single" w:color="auto" w:sz="4"/>
+          <w:right w:val="single" w:color="auto" w:sz="4"/>
+          <w:insideH w:val="single" w:color="auto" w:sz="4"/>
+          <w:insideV w:val="single" w:color="auto" w:sz="4"/>
+        </w:tblBorders>
+      </w:tblPr>
+      <w:tblGrid>
+        <w:gridCol w:w="700"/>
+        <w:gridCol w:w="2500"/>
+        <w:gridCol w:w="6160"/>
+      </w:tblGrid>
+      <w:tr>
+        <w:trPr>
+          <w:tblHeader/>
+        </w:trPr>
+        <w:tc>
+          <w:tcPr>
+            <w:tcW w:type="dxa" w:w="700"/>
+            <w:tcBorders>
+              <w:top w:val="single" w:color="CCCCCC" w:sz="1"/>
+              <w:left w:val="single" w:color="CCCCCC" w:sz="1"/>
+              <w:bottom w:val="single" w:color="CCCCCC" w:sz="1"/>
+              <w:right w:val="single" w:color="CCCCCC" w:sz="1"/>
+            </w:tcBorders>
+            <w:shd w:fill="1A7A6E" w:val="clear"/>
+            <w:tcMar>
+              <w:top w:type="dxa" w:w="80"/>
+              <w:left w:type="dxa" w:w="120"/>
+              <w:bottom w:type="dxa" w:w="80"/>
+              <w:right w:type="dxa" w:w="120"/>
+            </w:tcMar>
+          </w:tcPr>
+          <w:p>
+            <w:r>
+              <w:rPr>
+                <w:rFonts w:ascii="Arial" w:cs="Arial" w:eastAsia="Arial" w:hAnsi="Arial"/>
+                <w:b/>
+                <w:bCs/>
+                <w:color w:val="FFFFFF"/>
+                <w:sz w:val="18"/>
+                <w:szCs w:val="18"/>
+              </w:rPr>
+              <w:t xml:space="preserve">unit</w:t>
+            </w:r>
+          </w:p>
+        </w:tc>
+        <w:tc>
+          <w:tcPr>
+            <w:tcW w:type="dxa" w:w="2500"/>
+            <w:tcBorders>
+              <w:top w:val="single" w:color="CCCCCC" w:sz="1"/>
+              <w:left w:val="single" w:color="CCCCCC" w:sz="1"/>
+              <w:bottom w:val="single" w:color="CCCCCC" w:sz="1"/>
+              <w:right w:val="single" w:color="CCCCCC" w:sz="1"/>
+            </w:tcBorders>
+            <w:shd w:fill="1A7A6E" w:val="clear"/>
+            <w:tcMar>
+              <w:top w:type="dxa" w:w="80"/>
+              <w:left w:type="dxa" w:w="120"/>
+              <w:bottom w:type="dxa" w:w="80"/>
+              <w:right w:type="dxa" w:w="120"/>
+            </w:tcMar>
+          </w:tcPr>
+          <w:p>
+            <w:r>
+              <w:rPr>
+                <w:rFonts w:ascii="Arial" w:cs="Arial" w:eastAsia="Arial" w:hAnsi="Arial"/>
+                <w:b/>
+                <w:bCs/>
+                <w:color w:val="FFFFFF"/>
+                <w:sz w:val="18"/>
+                <w:szCs w:val="18"/>
+              </w:rPr>
+              <w:t xml:space="preserve">제목</w:t>
+            </w:r>
+          </w:p>
+        </w:tc>
+        <w:tc>
+          <w:tcPr>
+            <w:tcW w:type="dxa" w:w="6160"/>
+            <w:tcBorders>
+              <w:top w:val="single" w:color="CCCCCC" w:sz="1"/>
+              <w:left w:val="single" w:color="CCCCCC" w:sz="1"/>
+              <w:bottom w:val="single" w:color="CCCCCC" w:sz="1"/>
+              <w:right w:val="single" w:color="CCCCCC" w:sz="1"/>
+            </w:tcBorders>
+            <w:shd w:fill="1A7A6E" w:val="clear"/>
+            <w:tcMar>
+              <w:top w:type="dxa" w:w="80"/>
+              <w:left w:type="dxa" w:w="120"/>
+              <w:bottom w:type="dxa" w:w="80"/>
+              <w:right w:type="dxa" w:w="120"/>
+            </w:tcMar>
+          </w:tcPr>
+          <w:p>
+            <w:r>
+              <w:rPr>
+                <w:rFonts w:ascii="Arial" w:cs="Arial" w:eastAsia="Arial" w:hAnsi="Arial"/>
+                <w:b/>
+                <w:bCs/>
+                <w:color w:val="FFFFFF"/>
+                <w:sz w:val="18"/>
+                <w:szCs w:val="18"/>
+              </w:rPr>
+              <w:t xml:space="preserve">핵심 문법</w:t>
+            </w:r>
+          </w:p>
+        </w:tc>
+      </w:tr>
+      <w:tr>
+        <w:trPr>
+          <w:tblHeader w:val="false"/>
+        </w:trPr>
+        <w:tc>
+          <w:tcPr>
+            <w:tcW w:type="dxa" w:w="700"/>
+            <w:tcBorders>
+              <w:top w:val="single" w:color="CCCCCC" w:sz="1"/>
+              <w:left w:val="single" w:color="CCCCCC" w:sz="1"/>
+              <w:bottom w:val="single" w:color="CCCCCC" w:sz="1"/>
+              <w:right w:val="single" w:color="CCCCCC" w:sz="1"/>
+            </w:tcBorders>
+            <w:shd w:fill="E8F5F3" w:val="clear"/>
+            <w:tcMar>
+              <w:top w:type="dxa" w:w="80"/>
+              <w:left w:type="dxa" w:w="120"/>
+              <w:bottom w:type="dxa" w:w="80"/>
+              <w:right w:type="dxa" w:w="120"/>
+            </w:tcMar>
+          </w:tcPr>
+          <w:p>
+            <w:r>
+              <w:rPr>
+                <w:rFonts w:ascii="Arial" w:cs="Arial" w:eastAsia="Arial" w:hAnsi="Arial"/>
+                <w:b w:val="false"/>
+                <w:bCs w:val="false"/>
+                <w:color w:val="222222"/>
+                <w:sz w:val="18"/>
+                <w:szCs w:val="18"/>
+              </w:rPr>
+              <w:t xml:space="preserve">01</w:t>
+            </w:r>
+          </w:p>
+        </w:tc>
+        <w:tc>
+          <w:tcPr>
+            <w:tcW w:type="dxa" w:w="2500"/>
+            <w:tcBorders>
+              <w:top w:val="single" w:color="CCCCCC" w:sz="1"/>
+              <w:left w:val="single" w:color="CCCCCC" w:sz="1"/>
+              <w:bottom w:val="single" w:color="CCCCCC" w:sz="1"/>
+              <w:right w:val="single" w:color="CCCCCC" w:sz="1"/>
+            </w:tcBorders>
+            <w:shd w:fill="FFFFFF" w:val="clear"/>
+            <w:tcMar>
+              <w:top w:type="dxa" w:w="80"/>
+              <w:left w:type="dxa" w:w="120"/>
+              <w:bottom w:type="dxa" w:w="80"/>
+              <w:right w:type="dxa" w:w="120"/>
+            </w:tcMar>
+          </w:tcPr>
+          <w:p>
+            <w:r>
+              <w:rPr>
+                <w:rFonts w:ascii="Arial" w:cs="Arial" w:eastAsia="Arial" w:hAnsi="Arial"/>
+                <w:b w:val="false"/>
+                <w:bCs w:val="false"/>
+                <w:color w:val="222222"/>
+                <w:sz w:val="18"/>
+                <w:szCs w:val="18"/>
+              </w:rPr>
+              <w:t xml:space="preserve">강아지가 뭘 해요?</w:t>
+            </w:r>
+          </w:p>
+        </w:tc>
+        <w:tc>
+          <w:tcPr>
+            <w:tcW w:type="dxa" w:w="6160"/>
+            <w:tcBorders>
+              <w:top w:val="single" w:color="CCCCCC" w:sz="1"/>
+              <w:left w:val="single" w:color="CCCCCC" w:sz="1"/>
+              <w:bottom w:val="single" w:color="CCCCCC" w:sz="1"/>
+              <w:right w:val="single" w:color="CCCCCC" w:sz="1"/>
+            </w:tcBorders>
+            <w:shd w:fill="FFFFFF" w:val="clear"/>
+            <w:tcMar>
+              <w:top w:type="dxa" w:w="80"/>
+              <w:left w:type="dxa" w:w="120"/>
+              <w:bottom w:type="dxa" w:w="80"/>
+              <w:right w:type="dxa" w:w="120"/>
+            </w:tcMar>
+          </w:tcPr>
+          <w:p>
+            <w:r>
+              <w:rPr>
+                <w:rFonts w:ascii="Arial" w:cs="Arial" w:eastAsia="Arial" w:hAnsi="Arial"/>
+                <w:b w:val="false"/>
+                <w:bCs w:val="false"/>
+                <w:color w:val="222222"/>
+                <w:sz w:val="18"/>
+                <w:szCs w:val="18"/>
+              </w:rPr>
+              <w:t xml:space="preserve">이/가 (주격)</w:t>
+            </w:r>
+          </w:p>
+        </w:tc>
+      </w:tr>
+      <w:tr>
+        <w:trPr>
+          <w:tblHeader w:val="false"/>
+        </w:trPr>
+        <w:tc>
+          <w:tcPr>
+            <w:tcW w:type="dxa" w:w="700"/>
+            <w:tcBorders>
+              <w:top w:val="single" w:color="CCCCCC" w:sz="1"/>
+              <w:left w:val="single" w:color="CCCCCC" w:sz="1"/>
+              <w:bottom w:val="single" w:color="CCCCCC" w:sz="1"/>
+              <w:right w:val="single" w:color="CCCCCC" w:sz="1"/>
+            </w:tcBorders>
+            <w:shd w:fill="E8F5F3" w:val="clear"/>
+            <w:tcMar>
+              <w:top w:type="dxa" w:w="80"/>
+              <w:left w:type="dxa" w:w="120"/>
+              <w:bottom w:type="dxa" w:w="80"/>
+              <w:right w:type="dxa" w:w="120"/>
+            </w:tcMar>
+          </w:tcPr>
+          <w:p>
+            <w:r>
+              <w:rPr>
+                <w:rFonts w:ascii="Arial" w:cs="Arial" w:eastAsia="Arial" w:hAnsi="Arial"/>
+                <w:b w:val="false"/>
+                <w:bCs w:val="false"/>
+                <w:color w:val="222222"/>
+                <w:sz w:val="18"/>
+                <w:szCs w:val="18"/>
+              </w:rPr>
+              <w:t xml:space="preserve">02</w:t>
+            </w:r>
+          </w:p>
+        </w:tc>
+        <w:tc>
+          <w:tcPr>
+            <w:tcW w:type="dxa" w:w="2500"/>
+            <w:tcBorders>
+              <w:top w:val="single" w:color="CCCCCC" w:sz="1"/>
+              <w:left w:val="single" w:color="CCCCCC" w:sz="1"/>
+              <w:bottom w:val="single" w:color="CCCCCC" w:sz="1"/>
+              <w:right w:val="single" w:color="CCCCCC" w:sz="1"/>
+            </w:tcBorders>
+            <w:shd w:fill="FFFFFF" w:val="clear"/>
+            <w:tcMar>
+              <w:top w:type="dxa" w:w="80"/>
+              <w:left w:type="dxa" w:w="120"/>
+              <w:bottom w:type="dxa" w:w="80"/>
+              <w:right w:type="dxa" w:w="120"/>
+            </w:tcMar>
+          </w:tcPr>
+          <w:p>
+            <w:r>
+              <w:rPr>
+                <w:rFonts w:ascii="Arial" w:cs="Arial" w:eastAsia="Arial" w:hAnsi="Arial"/>
+                <w:b w:val="false"/>
+                <w:bCs w:val="false"/>
+                <w:color w:val="222222"/>
+                <w:sz w:val="18"/>
+                <w:szCs w:val="18"/>
+              </w:rPr>
+              <w:t xml:space="preserve">형하고 나는 태권도를 해요</w:t>
+            </w:r>
+          </w:p>
+        </w:tc>
+        <w:tc>
+          <w:tcPr>
+            <w:tcW w:type="dxa" w:w="6160"/>
+            <w:tcBorders>
+              <w:top w:val="single" w:color="CCCCCC" w:sz="1"/>
+              <w:left w:val="single" w:color="CCCCCC" w:sz="1"/>
+              <w:bottom w:val="single" w:color="CCCCCC" w:sz="1"/>
+              <w:right w:val="single" w:color="CCCCCC" w:sz="1"/>
+            </w:tcBorders>
+            <w:shd w:fill="FFFFFF" w:val="clear"/>
+            <w:tcMar>
+              <w:top w:type="dxa" w:w="80"/>
+              <w:left w:type="dxa" w:w="120"/>
+              <w:bottom w:type="dxa" w:w="80"/>
+              <w:right w:type="dxa" w:w="120"/>
+            </w:tcMar>
+          </w:tcPr>
+          <w:p>
+            <w:r>
+              <w:rPr>
+                <w:rFonts w:ascii="Arial" w:cs="Arial" w:eastAsia="Arial" w:hAnsi="Arial"/>
+                <w:b w:val="false"/>
+                <w:bCs w:val="false"/>
+                <w:color w:val="222222"/>
+                <w:sz w:val="18"/>
+                <w:szCs w:val="18"/>
+              </w:rPr>
+              <w:t xml:space="preserve">하고 / 은/는</w:t>
+            </w:r>
+          </w:p>
+        </w:tc>
+      </w:tr>
+      <w:tr>
+        <w:trPr>
+          <w:tblHeader w:val="false"/>
+        </w:trPr>
+        <w:tc>
+          <w:tcPr>
+            <w:tcW w:type="dxa" w:w="700"/>
+            <w:tcBorders>
+              <w:top w:val="single" w:color="CCCCCC" w:sz="1"/>
+              <w:left w:val="single" w:color="CCCCCC" w:sz="1"/>
+              <w:bottom w:val="single" w:color="CCCCCC" w:sz="1"/>
+              <w:right w:val="single" w:color="CCCCCC" w:sz="1"/>
+            </w:tcBorders>
+            <w:shd w:fill="E8F5F3" w:val="clear"/>
+            <w:tcMar>
+              <w:top w:type="dxa" w:w="80"/>
+              <w:left w:type="dxa" w:w="120"/>
+              <w:bottom w:type="dxa" w:w="80"/>
+              <w:right w:type="dxa" w:w="120"/>
+            </w:tcMar>
+          </w:tcPr>
+          <w:p>
+            <w:r>
+              <w:rPr>
+                <w:rFonts w:ascii="Arial" w:cs="Arial" w:eastAsia="Arial" w:hAnsi="Arial"/>
+                <w:b w:val="false"/>
+                <w:bCs w:val="false"/>
+                <w:color w:val="222222"/>
+                <w:sz w:val="18"/>
+                <w:szCs w:val="18"/>
+              </w:rPr>
+              <w:t xml:space="preserve">03</w:t>
+            </w:r>
+          </w:p>
+        </w:tc>
+        <w:tc>
+          <w:tcPr>
+            <w:tcW w:type="dxa" w:w="2500"/>
+            <w:tcBorders>
+              <w:top w:val="single" w:color="CCCCCC" w:sz="1"/>
+              <w:left w:val="single" w:color="CCCCCC" w:sz="1"/>
+              <w:bottom w:val="single" w:color="CCCCCC" w:sz="1"/>
+              <w:right w:val="single" w:color="CCCCCC" w:sz="1"/>
+            </w:tcBorders>
+            <w:shd w:fill="FFFFFF" w:val="clear"/>
+            <w:tcMar>
+              <w:top w:type="dxa" w:w="80"/>
+              <w:left w:type="dxa" w:w="120"/>
+              <w:bottom w:type="dxa" w:w="80"/>
+              <w:right w:type="dxa" w:w="120"/>
+            </w:tcMar>
+          </w:tcPr>
+          <w:p>
+            <w:r>
+              <w:rPr>
+                <w:rFonts w:ascii="Arial" w:cs="Arial" w:eastAsia="Arial" w:hAnsi="Arial"/>
+                <w:b w:val="false"/>
+                <w:bCs w:val="false"/>
+                <w:color w:val="222222"/>
+                <w:sz w:val="18"/>
+                <w:szCs w:val="18"/>
+              </w:rPr>
+              <w:t xml:space="preserve">언제 할머니 집에 가요?</w:t>
+            </w:r>
+          </w:p>
+        </w:tc>
+        <w:tc>
+          <w:tcPr>
+            <w:tcW w:type="dxa" w:w="6160"/>
+            <w:tcBorders>
+              <w:top w:val="single" w:color="CCCCCC" w:sz="1"/>
+              <w:left w:val="single" w:color="CCCCCC" w:sz="1"/>
+              <w:bottom w:val="single" w:color="CCCCCC" w:sz="1"/>
+              <w:right w:val="single" w:color="CCCCCC" w:sz="1"/>
+            </w:tcBorders>
+            <w:shd w:fill="FFFFFF" w:val="clear"/>
+            <w:tcMar>
+              <w:top w:type="dxa" w:w="80"/>
+              <w:left w:type="dxa" w:w="120"/>
+              <w:bottom w:type="dxa" w:w="80"/>
+              <w:right w:type="dxa" w:w="120"/>
+            </w:tcMar>
+          </w:tcPr>
+          <w:p>
+            <w:r>
+              <w:rPr>
+                <w:rFonts w:ascii="Arial" w:cs="Arial" w:eastAsia="Arial" w:hAnsi="Arial"/>
+                <w:b w:val="false"/>
+                <w:bCs w:val="false"/>
+                <w:color w:val="222222"/>
+                <w:sz w:val="18"/>
+                <w:szCs w:val="18"/>
+              </w:rPr>
+              <w:t xml:space="preserve">시간+에 / 을/를 / ~할까?</w:t>
+            </w:r>
+          </w:p>
+        </w:tc>
+      </w:tr>
+      <w:tr>
+        <w:trPr>
+          <w:tblHeader w:val="false"/>
+        </w:trPr>
+        <w:tc>
+          <w:tcPr>
+            <w:tcW w:type="dxa" w:w="700"/>
+            <w:tcBorders>
+              <w:top w:val="single" w:color="CCCCCC" w:sz="1"/>
+              <w:left w:val="single" w:color="CCCCCC" w:sz="1"/>
+              <w:bottom w:val="single" w:color="CCCCCC" w:sz="1"/>
+              <w:right w:val="single" w:color="CCCCCC" w:sz="1"/>
+            </w:tcBorders>
+            <w:shd w:fill="E8F5F3" w:val="clear"/>
+            <w:tcMar>
+              <w:top w:type="dxa" w:w="80"/>
+              <w:left w:type="dxa" w:w="120"/>
+              <w:bottom w:type="dxa" w:w="80"/>
+              <w:right w:type="dxa" w:w="120"/>
+            </w:tcMar>
+          </w:tcPr>
+          <w:p>
+            <w:r>
+              <w:rPr>
+                <w:rFonts w:ascii="Arial" w:cs="Arial" w:eastAsia="Arial" w:hAnsi="Arial"/>
+                <w:b w:val="false"/>
+                <w:bCs w:val="false"/>
+                <w:color w:val="222222"/>
+                <w:sz w:val="18"/>
+                <w:szCs w:val="18"/>
+              </w:rPr>
+              <w:t xml:space="preserve">04</w:t>
+            </w:r>
+          </w:p>
+        </w:tc>
+        <w:tc>
+          <w:tcPr>
+            <w:tcW w:type="dxa" w:w="2500"/>
+            <w:tcBorders>
+              <w:top w:val="single" w:color="CCCCCC" w:sz="1"/>
+              <w:left w:val="single" w:color="CCCCCC" w:sz="1"/>
+              <w:bottom w:val="single" w:color="CCCCCC" w:sz="1"/>
+              <w:right w:val="single" w:color="CCCCCC" w:sz="1"/>
+            </w:tcBorders>
+            <w:shd w:fill="FFFFFF" w:val="clear"/>
+            <w:tcMar>
+              <w:top w:type="dxa" w:w="80"/>
+              <w:left w:type="dxa" w:w="120"/>
+              <w:bottom w:type="dxa" w:w="80"/>
+              <w:right w:type="dxa" w:w="120"/>
+            </w:tcMar>
+          </w:tcPr>
+          <w:p>
+            <w:r>
+              <w:rPr>
+                <w:rFonts w:ascii="Arial" w:cs="Arial" w:eastAsia="Arial" w:hAnsi="Arial"/>
+                <w:b w:val="false"/>
+                <w:bCs w:val="false"/>
+                <w:color w:val="222222"/>
+                <w:sz w:val="18"/>
+                <w:szCs w:val="18"/>
+              </w:rPr>
+              <w:t xml:space="preserve">사과가 어디에 있어요?</w:t>
+            </w:r>
+          </w:p>
+        </w:tc>
+        <w:tc>
+          <w:tcPr>
+            <w:tcW w:type="dxa" w:w="6160"/>
+            <w:tcBorders>
+              <w:top w:val="single" w:color="CCCCCC" w:sz="1"/>
+              <w:left w:val="single" w:color="CCCCCC" w:sz="1"/>
+              <w:bottom w:val="single" w:color="CCCCCC" w:sz="1"/>
+              <w:right w:val="single" w:color="CCCCCC" w:sz="1"/>
+            </w:tcBorders>
+            <w:shd w:fill="FFFFFF" w:val="clear"/>
+            <w:tcMar>
+              <w:top w:type="dxa" w:w="80"/>
+              <w:left w:type="dxa" w:w="120"/>
+              <w:bottom w:type="dxa" w:w="80"/>
+              <w:right w:type="dxa" w:w="120"/>
+            </w:tcMar>
+          </w:tcPr>
+          <w:p>
+            <w:r>
+              <w:rPr>
+                <w:rFonts w:ascii="Arial" w:cs="Arial" w:eastAsia="Arial" w:hAnsi="Arial"/>
+                <w:b w:val="false"/>
+                <w:bCs w:val="false"/>
+                <w:color w:val="222222"/>
+                <w:sz w:val="18"/>
+                <w:szCs w:val="18"/>
+              </w:rPr>
+              <w:t xml:space="preserve">있어요/없어요 / 이.그.저</w:t>
+            </w:r>
+          </w:p>
+        </w:tc>
+      </w:tr>
+      <w:tr>
+        <w:trPr>
+          <w:tblHeader w:val="false"/>
+        </w:trPr>
+        <w:tc>
+          <w:tcPr>
+            <w:tcW w:type="dxa" w:w="700"/>
+            <w:tcBorders>
+              <w:top w:val="single" w:color="CCCCCC" w:sz="1"/>
+              <w:left w:val="single" w:color="CCCCCC" w:sz="1"/>
+              <w:bottom w:val="single" w:color="CCCCCC" w:sz="1"/>
+              <w:right w:val="single" w:color="CCCCCC" w:sz="1"/>
+            </w:tcBorders>
+            <w:shd w:fill="E8F5F3" w:val="clear"/>
+            <w:tcMar>
+              <w:top w:type="dxa" w:w="80"/>
+              <w:left w:type="dxa" w:w="120"/>
+              <w:bottom w:type="dxa" w:w="80"/>
+              <w:right w:type="dxa" w:w="120"/>
+            </w:tcMar>
+          </w:tcPr>
+          <w:p>
+            <w:r>
+              <w:rPr>
+                <w:rFonts w:ascii="Arial" w:cs="Arial" w:eastAsia="Arial" w:hAnsi="Arial"/>
+                <w:b w:val="false"/>
+                <w:bCs w:val="false"/>
+                <w:color w:val="222222"/>
+                <w:sz w:val="18"/>
+                <w:szCs w:val="18"/>
+              </w:rPr>
+              <w:t xml:space="preserve">05</w:t>
+            </w:r>
+          </w:p>
+        </w:tc>
+        <w:tc>
+          <w:tcPr>
+            <w:tcW w:type="dxa" w:w="2500"/>
+            <w:tcBorders>
+              <w:top w:val="single" w:color="CCCCCC" w:sz="1"/>
+              <w:left w:val="single" w:color="CCCCCC" w:sz="1"/>
+              <w:bottom w:val="single" w:color="CCCCCC" w:sz="1"/>
+              <w:right w:val="single" w:color="CCCCCC" w:sz="1"/>
+            </w:tcBorders>
+            <w:shd w:fill="FFFFFF" w:val="clear"/>
+            <w:tcMar>
+              <w:top w:type="dxa" w:w="80"/>
+              <w:left w:type="dxa" w:w="120"/>
+              <w:bottom w:type="dxa" w:w="80"/>
+              <w:right w:type="dxa" w:w="120"/>
+            </w:tcMar>
+          </w:tcPr>
+          <w:p>
+            <w:r>
+              <w:rPr>
+                <w:rFonts w:ascii="Arial" w:cs="Arial" w:eastAsia="Arial" w:hAnsi="Arial"/>
+                <w:b w:val="false"/>
+                <w:bCs w:val="false"/>
+                <w:color w:val="222222"/>
+                <w:sz w:val="18"/>
+                <w:szCs w:val="18"/>
+              </w:rPr>
+              <w:t xml:space="preserve">동물원에 가요</w:t>
+            </w:r>
+          </w:p>
+        </w:tc>
+        <w:tc>
+          <w:tcPr>
+            <w:tcW w:type="dxa" w:w="6160"/>
+            <w:tcBorders>
+              <w:top w:val="single" w:color="CCCCCC" w:sz="1"/>
+              <w:left w:val="single" w:color="CCCCCC" w:sz="1"/>
+              <w:bottom w:val="single" w:color="CCCCCC" w:sz="1"/>
+              <w:right w:val="single" w:color="CCCCCC" w:sz="1"/>
+            </w:tcBorders>
+            <w:shd w:fill="FFFFFF" w:val="clear"/>
+            <w:tcMar>
+              <w:top w:type="dxa" w:w="80"/>
+              <w:left w:type="dxa" w:w="120"/>
+              <w:bottom w:type="dxa" w:w="80"/>
+              <w:right w:type="dxa" w:w="120"/>
+            </w:tcMar>
+          </w:tcPr>
+          <w:p>
+            <w:r>
+              <w:rPr>
+                <w:rFonts w:ascii="Arial" w:cs="Arial" w:eastAsia="Arial" w:hAnsi="Arial"/>
+                <w:b w:val="false"/>
+                <w:bCs w:val="false"/>
+                <w:color w:val="222222"/>
+                <w:sz w:val="18"/>
+                <w:szCs w:val="18"/>
+              </w:rPr>
+              <w:t xml:space="preserve">N이/가 아니에요 / 에 위치 / 이/가 vs 은/는</w:t>
+            </w:r>
+          </w:p>
+        </w:tc>
+      </w:tr>
+      <w:tr>
+        <w:trPr>
+          <w:tblHeader w:val="false"/>
+        </w:trPr>
+        <w:tc>
+          <w:tcPr>
+            <w:tcW w:type="dxa" w:w="700"/>
+            <w:tcBorders>
+              <w:top w:val="single" w:color="CCCCCC" w:sz="1"/>
+              <w:left w:val="single" w:color="CCCCCC" w:sz="1"/>
+              <w:bottom w:val="single" w:color="CCCCCC" w:sz="1"/>
+              <w:right w:val="single" w:color="CCCCCC" w:sz="1"/>
+            </w:tcBorders>
+            <w:shd w:fill="E8F5F3" w:val="clear"/>
+            <w:tcMar>
+              <w:top w:type="dxa" w:w="80"/>
+              <w:left w:type="dxa" w:w="120"/>
+              <w:bottom w:type="dxa" w:w="80"/>
+              <w:right w:type="dxa" w:w="120"/>
+            </w:tcMar>
+          </w:tcPr>
+          <w:p>
+            <w:r>
+              <w:rPr>
+                <w:rFonts w:ascii="Arial" w:cs="Arial" w:eastAsia="Arial" w:hAnsi="Arial"/>
+                <w:b w:val="false"/>
+                <w:bCs w:val="false"/>
+                <w:color w:val="222222"/>
+                <w:sz w:val="18"/>
+                <w:szCs w:val="18"/>
+              </w:rPr>
+              <w:t xml:space="preserve">06</w:t>
+            </w:r>
+          </w:p>
+        </w:tc>
+        <w:tc>
+          <w:tcPr>
+            <w:tcW w:type="dxa" w:w="2500"/>
+            <w:tcBorders>
+              <w:top w:val="single" w:color="CCCCCC" w:sz="1"/>
+              <w:left w:val="single" w:color="CCCCCC" w:sz="1"/>
+              <w:bottom w:val="single" w:color="CCCCCC" w:sz="1"/>
+              <w:right w:val="single" w:color="CCCCCC" w:sz="1"/>
+            </w:tcBorders>
+            <w:shd w:fill="FFFFFF" w:val="clear"/>
+            <w:tcMar>
+              <w:top w:type="dxa" w:w="80"/>
+              <w:left w:type="dxa" w:w="120"/>
+              <w:bottom w:type="dxa" w:w="80"/>
+              <w:right w:type="dxa" w:w="120"/>
+            </w:tcMar>
+          </w:tcPr>
+          <w:p>
+            <w:r>
+              <w:rPr>
+                <w:rFonts w:ascii="Arial" w:cs="Arial" w:eastAsia="Arial" w:hAnsi="Arial"/>
+                <w:b w:val="false"/>
+                <w:bCs w:val="false"/>
+                <w:color w:val="222222"/>
+                <w:sz w:val="18"/>
+                <w:szCs w:val="18"/>
+              </w:rPr>
+              <w:t xml:space="preserve">형은 방에서 숙제를 해요</w:t>
+            </w:r>
+          </w:p>
+        </w:tc>
+        <w:tc>
+          <w:tcPr>
+            <w:tcW w:type="dxa" w:w="6160"/>
+            <w:tcBorders>
+              <w:top w:val="single" w:color="CCCCCC" w:sz="1"/>
+              <w:left w:val="single" w:color="CCCCCC" w:sz="1"/>
+              <w:bottom w:val="single" w:color="CCCCCC" w:sz="1"/>
+              <w:right w:val="single" w:color="CCCCCC" w:sz="1"/>
+            </w:tcBorders>
+            <w:shd w:fill="FFFFFF" w:val="clear"/>
+            <w:tcMar>
+              <w:top w:type="dxa" w:w="80"/>
+              <w:left w:type="dxa" w:w="120"/>
+              <w:bottom w:type="dxa" w:w="80"/>
+              <w:right w:type="dxa" w:w="120"/>
+            </w:tcMar>
+          </w:tcPr>
+          <w:p>
+            <w:r>
+              <w:rPr>
+                <w:rFonts w:ascii="Arial" w:cs="Arial" w:eastAsia="Arial" w:hAnsi="Arial"/>
+                <w:b w:val="false"/>
+                <w:bCs w:val="false"/>
+                <w:color w:val="222222"/>
+                <w:sz w:val="18"/>
+                <w:szCs w:val="18"/>
+              </w:rPr>
+              <w:t xml:space="preserve">에서 활동 장소 / 해요 vs 해</w:t>
+            </w:r>
+          </w:p>
+        </w:tc>
+      </w:tr>
+      <w:tr>
+        <w:trPr>
+          <w:tblHeader w:val="false"/>
+        </w:trPr>
+        <w:tc>
+          <w:tcPr>
+            <w:tcW w:type="dxa" w:w="700"/>
+            <w:tcBorders>
+              <w:top w:val="single" w:color="CCCCCC" w:sz="1"/>
+              <w:left w:val="single" w:color="CCCCCC" w:sz="1"/>
+              <w:bottom w:val="single" w:color="CCCCCC" w:sz="1"/>
+              <w:right w:val="single" w:color="CCCCCC" w:sz="1"/>
+            </w:tcBorders>
+            <w:shd w:fill="E8F5F3" w:val="clear"/>
+            <w:tcMar>
+              <w:top w:type="dxa" w:w="80"/>
+              <w:left w:type="dxa" w:w="120"/>
+              <w:bottom w:type="dxa" w:w="80"/>
+              <w:right w:type="dxa" w:w="120"/>
+            </w:tcMar>
+          </w:tcPr>
+          <w:p>
+            <w:r>
+              <w:rPr>
+                <w:rFonts w:ascii="Arial" w:cs="Arial" w:eastAsia="Arial" w:hAnsi="Arial"/>
+                <w:b w:val="false"/>
+                <w:bCs w:val="false"/>
+                <w:color w:val="222222"/>
+                <w:sz w:val="18"/>
+                <w:szCs w:val="18"/>
+              </w:rPr>
+              <w:t xml:space="preserve">07</w:t>
+            </w:r>
+          </w:p>
+        </w:tc>
+        <w:tc>
+          <w:tcPr>
+            <w:tcW w:type="dxa" w:w="2500"/>
+            <w:tcBorders>
+              <w:top w:val="single" w:color="CCCCCC" w:sz="1"/>
+              <w:left w:val="single" w:color="CCCCCC" w:sz="1"/>
+              <w:bottom w:val="single" w:color="CCCCCC" w:sz="1"/>
+              <w:right w:val="single" w:color="CCCCCC" w:sz="1"/>
+            </w:tcBorders>
+            <w:shd w:fill="FFFFFF" w:val="clear"/>
+            <w:tcMar>
+              <w:top w:type="dxa" w:w="80"/>
+              <w:left w:type="dxa" w:w="120"/>
+              <w:bottom w:type="dxa" w:w="80"/>
+              <w:right w:type="dxa" w:w="120"/>
+            </w:tcMar>
+          </w:tcPr>
+          <w:p>
+            <w:r>
+              <w:rPr>
+                <w:rFonts w:ascii="Arial" w:cs="Arial" w:eastAsia="Arial" w:hAnsi="Arial"/>
+                <w:b w:val="false"/>
+                <w:bCs w:val="false"/>
+                <w:color w:val="222222"/>
+                <w:sz w:val="18"/>
+                <w:szCs w:val="18"/>
+              </w:rPr>
+              <w:t xml:space="preserve">숫자 놀이를 해요</w:t>
+            </w:r>
+          </w:p>
+        </w:tc>
+        <w:tc>
+          <w:tcPr>
+            <w:tcW w:type="dxa" w:w="6160"/>
+            <w:tcBorders>
+              <w:top w:val="single" w:color="CCCCCC" w:sz="1"/>
+              <w:left w:val="single" w:color="CCCCCC" w:sz="1"/>
+              <w:bottom w:val="single" w:color="CCCCCC" w:sz="1"/>
+              <w:right w:val="single" w:color="CCCCCC" w:sz="1"/>
+            </w:tcBorders>
+            <w:shd w:fill="FFFFFF" w:val="clear"/>
+            <w:tcMar>
+              <w:top w:type="dxa" w:w="80"/>
+              <w:left w:type="dxa" w:w="120"/>
+              <w:bottom w:type="dxa" w:w="80"/>
+              <w:right w:type="dxa" w:w="120"/>
+            </w:tcMar>
+          </w:tcPr>
+          <w:p>
+            <w:r>
+              <w:rPr>
+                <w:rFonts w:ascii="Arial" w:cs="Arial" w:eastAsia="Arial" w:hAnsi="Arial"/>
+                <w:b w:val="false"/>
+                <w:bCs w:val="false"/>
+                <w:color w:val="222222"/>
+                <w:sz w:val="18"/>
+                <w:szCs w:val="18"/>
+              </w:rPr>
+              <w:t xml:space="preserve">고유어 숫자 (게임 중심)</w:t>
+            </w:r>
+          </w:p>
+        </w:tc>
+      </w:tr>
+      <w:tr>
+        <w:trPr>
+          <w:tblHeader w:val="false"/>
+        </w:trPr>
+        <w:tc>
+          <w:tcPr>
+            <w:tcW w:type="dxa" w:w="700"/>
+            <w:tcBorders>
+              <w:top w:val="single" w:color="CCCCCC" w:sz="1"/>
+              <w:left w:val="single" w:color="CCCCCC" w:sz="1"/>
+              <w:bottom w:val="single" w:color="CCCCCC" w:sz="1"/>
+              <w:right w:val="single" w:color="CCCCCC" w:sz="1"/>
+            </w:tcBorders>
+            <w:shd w:fill="E8F5F3" w:val="clear"/>
+            <w:tcMar>
+              <w:top w:type="dxa" w:w="80"/>
+              <w:left w:type="dxa" w:w="120"/>
+              <w:bottom w:type="dxa" w:w="80"/>
+              <w:right w:type="dxa" w:w="120"/>
+            </w:tcMar>
+          </w:tcPr>
+          <w:p>
+            <w:r>
+              <w:rPr>
+                <w:rFonts w:ascii="Arial" w:cs="Arial" w:eastAsia="Arial" w:hAnsi="Arial"/>
+                <w:b w:val="false"/>
+                <w:bCs w:val="false"/>
+                <w:color w:val="222222"/>
+                <w:sz w:val="18"/>
+                <w:szCs w:val="18"/>
+              </w:rPr>
+              <w:t xml:space="preserve">08</w:t>
+            </w:r>
+          </w:p>
+        </w:tc>
+        <w:tc>
+          <w:tcPr>
+            <w:tcW w:type="dxa" w:w="2500"/>
+            <w:tcBorders>
+              <w:top w:val="single" w:color="CCCCCC" w:sz="1"/>
+              <w:left w:val="single" w:color="CCCCCC" w:sz="1"/>
+              <w:bottom w:val="single" w:color="CCCCCC" w:sz="1"/>
+              <w:right w:val="single" w:color="CCCCCC" w:sz="1"/>
+            </w:tcBorders>
+            <w:shd w:fill="FFFFFF" w:val="clear"/>
+            <w:tcMar>
+              <w:top w:type="dxa" w:w="80"/>
+              <w:left w:type="dxa" w:w="120"/>
+              <w:bottom w:type="dxa" w:w="80"/>
+              <w:right w:type="dxa" w:w="120"/>
+            </w:tcMar>
+          </w:tcPr>
+          <w:p>
+            <w:r>
+              <w:rPr>
+                <w:rFonts w:ascii="Arial" w:cs="Arial" w:eastAsia="Arial" w:hAnsi="Arial"/>
+                <w:b w:val="false"/>
+                <w:bCs w:val="false"/>
+                <w:color w:val="222222"/>
+                <w:sz w:val="18"/>
+                <w:szCs w:val="18"/>
+              </w:rPr>
+              <w:t xml:space="preserve">세어 보아요</w:t>
+            </w:r>
+          </w:p>
+        </w:tc>
+        <w:tc>
+          <w:tcPr>
+            <w:tcW w:type="dxa" w:w="6160"/>
+            <w:tcBorders>
+              <w:top w:val="single" w:color="CCCCCC" w:sz="1"/>
+              <w:left w:val="single" w:color="CCCCCC" w:sz="1"/>
+              <w:bottom w:val="single" w:color="CCCCCC" w:sz="1"/>
+              <w:right w:val="single" w:color="CCCCCC" w:sz="1"/>
+            </w:tcBorders>
+            <w:shd w:fill="FFFFFF" w:val="clear"/>
+            <w:tcMar>
+              <w:top w:type="dxa" w:w="80"/>
+              <w:left w:type="dxa" w:w="120"/>
+              <w:bottom w:type="dxa" w:w="80"/>
+              <w:right w:type="dxa" w:w="120"/>
+            </w:tcMar>
+          </w:tcPr>
+          <w:p>
+            <w:r>
+              <w:rPr>
+                <w:rFonts w:ascii="Arial" w:cs="Arial" w:eastAsia="Arial" w:hAnsi="Arial"/>
+                <w:b w:val="false"/>
+                <w:bCs w:val="false"/>
+                <w:color w:val="222222"/>
+                <w:sz w:val="18"/>
+                <w:szCs w:val="18"/>
+              </w:rPr>
+              <w:t xml:space="preserve">단위명사 (한/두/세/네)</w:t>
+            </w:r>
+          </w:p>
+        </w:tc>
+      </w:tr>
+      <w:tr>
+        <w:trPr>
+          <w:tblHeader w:val="false"/>
+        </w:trPr>
+        <w:tc>
+          <w:tcPr>
+            <w:tcW w:type="dxa" w:w="700"/>
+            <w:tcBorders>
+              <w:top w:val="single" w:color="CCCCCC" w:sz="1"/>
+              <w:left w:val="single" w:color="CCCCCC" w:sz="1"/>
+              <w:bottom w:val="single" w:color="CCCCCC" w:sz="1"/>
+              <w:right w:val="single" w:color="CCCCCC" w:sz="1"/>
+            </w:tcBorders>
+            <w:shd w:fill="E8F5F3" w:val="clear"/>
+            <w:tcMar>
+              <w:top w:type="dxa" w:w="80"/>
+              <w:left w:type="dxa" w:w="120"/>
+              <w:bottom w:type="dxa" w:w="80"/>
+              <w:right w:type="dxa" w:w="120"/>
+            </w:tcMar>
+          </w:tcPr>
+          <w:p>
+            <w:r>
+              <w:rPr>
+                <w:rFonts w:ascii="Arial" w:cs="Arial" w:eastAsia="Arial" w:hAnsi="Arial"/>
+                <w:b w:val="false"/>
+                <w:bCs w:val="false"/>
+                <w:color w:val="222222"/>
+                <w:sz w:val="18"/>
+                <w:szCs w:val="18"/>
+              </w:rPr>
+              <w:t xml:space="preserve">09</w:t>
+            </w:r>
+          </w:p>
+        </w:tc>
+        <w:tc>
+          <w:tcPr>
+            <w:tcW w:type="dxa" w:w="2500"/>
+            <w:tcBorders>
+              <w:top w:val="single" w:color="CCCCCC" w:sz="1"/>
+              <w:left w:val="single" w:color="CCCCCC" w:sz="1"/>
+              <w:bottom w:val="single" w:color="CCCCCC" w:sz="1"/>
+              <w:right w:val="single" w:color="CCCCCC" w:sz="1"/>
+            </w:tcBorders>
+            <w:shd w:fill="FFFFFF" w:val="clear"/>
+            <w:tcMar>
+              <w:top w:type="dxa" w:w="80"/>
+              <w:left w:type="dxa" w:w="120"/>
+              <w:bottom w:type="dxa" w:w="80"/>
+              <w:right w:type="dxa" w:w="120"/>
+            </w:tcMar>
+          </w:tcPr>
+          <w:p>
+            <w:r>
+              <w:rPr>
+                <w:rFonts w:ascii="Arial" w:cs="Arial" w:eastAsia="Arial" w:hAnsi="Arial"/>
+                <w:b w:val="false"/>
+                <w:bCs w:val="false"/>
+                <w:color w:val="222222"/>
+                <w:sz w:val="18"/>
+                <w:szCs w:val="18"/>
+              </w:rPr>
+              <w:t xml:space="preserve">갈비가 맛있어요</w:t>
+            </w:r>
+          </w:p>
+        </w:tc>
+        <w:tc>
+          <w:tcPr>
+            <w:tcW w:type="dxa" w:w="6160"/>
+            <w:tcBorders>
+              <w:top w:val="single" w:color="CCCCCC" w:sz="1"/>
+              <w:left w:val="single" w:color="CCCCCC" w:sz="1"/>
+              <w:bottom w:val="single" w:color="CCCCCC" w:sz="1"/>
+              <w:right w:val="single" w:color="CCCCCC" w:sz="1"/>
+            </w:tcBorders>
+            <w:shd w:fill="FFFFFF" w:val="clear"/>
+            <w:tcMar>
+              <w:top w:type="dxa" w:w="80"/>
+              <w:left w:type="dxa" w:w="120"/>
+              <w:bottom w:type="dxa" w:w="80"/>
+              <w:right w:type="dxa" w:w="120"/>
+            </w:tcMar>
+          </w:tcPr>
+          <w:p>
+            <w:r>
+              <w:rPr>
+                <w:rFonts w:ascii="Arial" w:cs="Arial" w:eastAsia="Arial" w:hAnsi="Arial"/>
+                <w:b w:val="false"/>
+                <w:bCs w:val="false"/>
+                <w:color w:val="222222"/>
+                <w:sz w:val="18"/>
+                <w:szCs w:val="18"/>
+              </w:rPr>
+              <w:t xml:space="preserve">형용사 문장 구조</w:t>
+            </w:r>
+          </w:p>
+        </w:tc>
+      </w:tr>
+    </w:tbl>
+    <w:p>
+      <w:pPr>
+        <w:spacing w:after="160"/>
+      </w:pPr>
+    </w:p>
+    <w:p>
+      <w:pPr>
+        <w:pStyle w:val="Heading2"/>
+      </w:pPr>
+      <w:r>
+        <w:rPr>
+          <w:rFonts w:ascii="Arial" w:cs="Arial" w:eastAsia="Arial" w:hAnsi="Arial"/>
+          <w:b/>
+          <w:bCs/>
+          <w:color w:val="1C3A5E"/>
+        </w:rPr>
+        <w:t xml:space="preserve">Kids Level 3 ✅  시제 + 조건 + 의무</w:t>
+      </w:r>
+    </w:p>
+    <w:tbl>
+      <w:tblPr>
+        <w:tblW w:type="dxa" w:w="10080"/>
+        <w:tblBorders>
+          <w:top w:val="single" w:color="auto" w:sz="4"/>
+          <w:left w:val="single" w:color="auto" w:sz="4"/>
+          <w:bottom w:val="single" w:color="auto" w:sz="4"/>
+          <w:right w:val="single" w:color="auto" w:sz="4"/>
+          <w:insideH w:val="single" w:color="auto" w:sz="4"/>
+          <w:insideV w:val="single" w:color="auto" w:sz="4"/>
+        </w:tblBorders>
+      </w:tblPr>
+      <w:tblGrid>
+        <w:gridCol w:w="700"/>
+        <w:gridCol w:w="2500"/>
+        <w:gridCol w:w="6160"/>
+      </w:tblGrid>
+      <w:tr>
+        <w:trPr>
+          <w:tblHeader/>
+        </w:trPr>
+        <w:tc>
+          <w:tcPr>
+            <w:tcW w:type="dxa" w:w="700"/>
+            <w:tcBorders>
+              <w:top w:val="single" w:color="CCCCCC" w:sz="1"/>
+              <w:left w:val="single" w:color="CCCCCC" w:sz="1"/>
+              <w:bottom w:val="single" w:color="CCCCCC" w:sz="1"/>
+              <w:right w:val="single" w:color="CCCCCC" w:sz="1"/>
+            </w:tcBorders>
+            <w:shd w:fill="1A7A6E" w:val="clear"/>
+            <w:tcMar>
+              <w:top w:type="dxa" w:w="80"/>
+              <w:left w:type="dxa" w:w="120"/>
+              <w:bottom w:type="dxa" w:w="80"/>
+              <w:right w:type="dxa" w:w="120"/>
+            </w:tcMar>
+          </w:tcPr>
+          <w:p>
+            <w:r>
+              <w:rPr>
+                <w:rFonts w:ascii="Arial" w:cs="Arial" w:eastAsia="Arial" w:hAnsi="Arial"/>
+                <w:b/>
+                <w:bCs/>
+                <w:color w:val="FFFFFF"/>
+                <w:sz w:val="18"/>
+                <w:szCs w:val="18"/>
+              </w:rPr>
+              <w:t xml:space="preserve">unit</w:t>
+            </w:r>
+          </w:p>
+        </w:tc>
+        <w:tc>
+          <w:tcPr>
+            <w:tcW w:type="dxa" w:w="2500"/>
+            <w:tcBorders>
+              <w:top w:val="single" w:color="CCCCCC" w:sz="1"/>
+              <w:left w:val="single" w:color="CCCCCC" w:sz="1"/>
+              <w:bottom w:val="single" w:color="CCCCCC" w:sz="1"/>
+              <w:right w:val="single" w:color="CCCCCC" w:sz="1"/>
+            </w:tcBorders>
+            <w:shd w:fill="1A7A6E" w:val="clear"/>
+            <w:tcMar>
+              <w:top w:type="dxa" w:w="80"/>
+              <w:left w:type="dxa" w:w="120"/>
+              <w:bottom w:type="dxa" w:w="80"/>
+              <w:right w:type="dxa" w:w="120"/>
+            </w:tcMar>
+          </w:tcPr>
+          <w:p>
+            <w:r>
+              <w:rPr>
+                <w:rFonts w:ascii="Arial" w:cs="Arial" w:eastAsia="Arial" w:hAnsi="Arial"/>
+                <w:b/>
+                <w:bCs/>
+                <w:color w:val="FFFFFF"/>
+                <w:sz w:val="18"/>
+                <w:szCs w:val="18"/>
+              </w:rPr>
+              <w:t xml:space="preserve">제목</w:t>
+            </w:r>
+          </w:p>
+        </w:tc>
+        <w:tc>
+          <w:tcPr>
+            <w:tcW w:type="dxa" w:w="6160"/>
+            <w:tcBorders>
+              <w:top w:val="single" w:color="CCCCCC" w:sz="1"/>
+              <w:left w:val="single" w:color="CCCCCC" w:sz="1"/>
+              <w:bottom w:val="single" w:color="CCCCCC" w:sz="1"/>
+              <w:right w:val="single" w:color="CCCCCC" w:sz="1"/>
+            </w:tcBorders>
+            <w:shd w:fill="1A7A6E" w:val="clear"/>
+            <w:tcMar>
+              <w:top w:type="dxa" w:w="80"/>
+              <w:left w:type="dxa" w:w="120"/>
+              <w:bottom w:type="dxa" w:w="80"/>
+              <w:right w:type="dxa" w:w="120"/>
+            </w:tcMar>
+          </w:tcPr>
+          <w:p>
+            <w:r>
+              <w:rPr>
+                <w:rFonts w:ascii="Arial" w:cs="Arial" w:eastAsia="Arial" w:hAnsi="Arial"/>
+                <w:b/>
+                <w:bCs/>
+                <w:color w:val="FFFFFF"/>
+                <w:sz w:val="18"/>
+                <w:szCs w:val="18"/>
+              </w:rPr>
+              <w:t xml:space="preserve">핵심 문법</w:t>
+            </w:r>
+          </w:p>
+        </w:tc>
+      </w:tr>
+      <w:tr>
+        <w:trPr>
+          <w:tblHeader w:val="false"/>
+        </w:trPr>
+        <w:tc>
+          <w:tcPr>
+            <w:tcW w:type="dxa" w:w="700"/>
+            <w:tcBorders>
+              <w:top w:val="single" w:color="CCCCCC" w:sz="1"/>
+              <w:left w:val="single" w:color="CCCCCC" w:sz="1"/>
+              <w:bottom w:val="single" w:color="CCCCCC" w:sz="1"/>
+              <w:right w:val="single" w:color="CCCCCC" w:sz="1"/>
+            </w:tcBorders>
+            <w:shd w:fill="E8F5F3" w:val="clear"/>
+            <w:tcMar>
+              <w:top w:type="dxa" w:w="80"/>
+              <w:left w:type="dxa" w:w="120"/>
+              <w:bottom w:type="dxa" w:w="80"/>
+              <w:right w:type="dxa" w:w="120"/>
+            </w:tcMar>
+          </w:tcPr>
+          <w:p>
+            <w:r>
+              <w:rPr>
+                <w:rFonts w:ascii="Arial" w:cs="Arial" w:eastAsia="Arial" w:hAnsi="Arial"/>
+                <w:b w:val="false"/>
+                <w:bCs w:val="false"/>
+                <w:color w:val="222222"/>
+                <w:sz w:val="18"/>
+                <w:szCs w:val="18"/>
+              </w:rPr>
+              <w:t xml:space="preserve">01</w:t>
+            </w:r>
+          </w:p>
+        </w:tc>
+        <w:tc>
+          <w:tcPr>
+            <w:tcW w:type="dxa" w:w="2500"/>
+            <w:tcBorders>
+              <w:top w:val="single" w:color="CCCCCC" w:sz="1"/>
+              <w:left w:val="single" w:color="CCCCCC" w:sz="1"/>
+              <w:bottom w:val="single" w:color="CCCCCC" w:sz="1"/>
+              <w:right w:val="single" w:color="CCCCCC" w:sz="1"/>
+            </w:tcBorders>
+            <w:shd w:fill="FFFFFF" w:val="clear"/>
+            <w:tcMar>
+              <w:top w:type="dxa" w:w="80"/>
+              <w:left w:type="dxa" w:w="120"/>
+              <w:bottom w:type="dxa" w:w="80"/>
+              <w:right w:type="dxa" w:w="120"/>
+            </w:tcMar>
+          </w:tcPr>
+          <w:p>
+            <w:r>
+              <w:rPr>
+                <w:rFonts w:ascii="Arial" w:cs="Arial" w:eastAsia="Arial" w:hAnsi="Arial"/>
+                <w:b w:val="false"/>
+                <w:bCs w:val="false"/>
+                <w:color w:val="222222"/>
+                <w:sz w:val="18"/>
+                <w:szCs w:val="18"/>
+              </w:rPr>
+              <w:t xml:space="preserve">곰 세 마리</w:t>
+            </w:r>
+          </w:p>
+        </w:tc>
+        <w:tc>
+          <w:tcPr>
+            <w:tcW w:type="dxa" w:w="6160"/>
+            <w:tcBorders>
+              <w:top w:val="single" w:color="CCCCCC" w:sz="1"/>
+              <w:left w:val="single" w:color="CCCCCC" w:sz="1"/>
+              <w:bottom w:val="single" w:color="CCCCCC" w:sz="1"/>
+              <w:right w:val="single" w:color="CCCCCC" w:sz="1"/>
+            </w:tcBorders>
+            <w:shd w:fill="FFFFFF" w:val="clear"/>
+            <w:tcMar>
+              <w:top w:type="dxa" w:w="80"/>
+              <w:left w:type="dxa" w:w="120"/>
+              <w:bottom w:type="dxa" w:w="80"/>
+              <w:right w:type="dxa" w:w="120"/>
+            </w:tcMar>
+          </w:tcPr>
+          <w:p>
+            <w:r>
+              <w:rPr>
+                <w:rFonts w:ascii="Arial" w:cs="Arial" w:eastAsia="Arial" w:hAnsi="Arial"/>
+                <w:b w:val="false"/>
+                <w:bCs w:val="false"/>
+                <w:color w:val="222222"/>
+                <w:sz w:val="18"/>
+                <w:szCs w:val="18"/>
+              </w:rPr>
+              <w:t xml:space="preserve">마리 단위 / 몇+단위명사?</w:t>
+            </w:r>
+          </w:p>
+        </w:tc>
+      </w:tr>
+      <w:tr>
+        <w:trPr>
+          <w:tblHeader w:val="false"/>
+        </w:trPr>
+        <w:tc>
+          <w:tcPr>
+            <w:tcW w:type="dxa" w:w="700"/>
+            <w:tcBorders>
+              <w:top w:val="single" w:color="CCCCCC" w:sz="1"/>
+              <w:left w:val="single" w:color="CCCCCC" w:sz="1"/>
+              <w:bottom w:val="single" w:color="CCCCCC" w:sz="1"/>
+              <w:right w:val="single" w:color="CCCCCC" w:sz="1"/>
+            </w:tcBorders>
+            <w:shd w:fill="E8F5F3" w:val="clear"/>
+            <w:tcMar>
+              <w:top w:type="dxa" w:w="80"/>
+              <w:left w:type="dxa" w:w="120"/>
+              <w:bottom w:type="dxa" w:w="80"/>
+              <w:right w:type="dxa" w:w="120"/>
+            </w:tcMar>
+          </w:tcPr>
+          <w:p>
+            <w:r>
+              <w:rPr>
+                <w:rFonts w:ascii="Arial" w:cs="Arial" w:eastAsia="Arial" w:hAnsi="Arial"/>
+                <w:b w:val="false"/>
+                <w:bCs w:val="false"/>
+                <w:color w:val="222222"/>
+                <w:sz w:val="18"/>
+                <w:szCs w:val="18"/>
+              </w:rPr>
+              <w:t xml:space="preserve">02</w:t>
+            </w:r>
+          </w:p>
+        </w:tc>
+        <w:tc>
+          <w:tcPr>
+            <w:tcW w:type="dxa" w:w="2500"/>
+            <w:tcBorders>
+              <w:top w:val="single" w:color="CCCCCC" w:sz="1"/>
+              <w:left w:val="single" w:color="CCCCCC" w:sz="1"/>
+              <w:bottom w:val="single" w:color="CCCCCC" w:sz="1"/>
+              <w:right w:val="single" w:color="CCCCCC" w:sz="1"/>
+            </w:tcBorders>
+            <w:shd w:fill="FFFFFF" w:val="clear"/>
+            <w:tcMar>
+              <w:top w:type="dxa" w:w="80"/>
+              <w:left w:type="dxa" w:w="120"/>
+              <w:bottom w:type="dxa" w:w="80"/>
+              <w:right w:type="dxa" w:w="120"/>
+            </w:tcMar>
+          </w:tcPr>
+          <w:p>
+            <w:r>
+              <w:rPr>
+                <w:rFonts w:ascii="Arial" w:cs="Arial" w:eastAsia="Arial" w:hAnsi="Arial"/>
+                <w:b w:val="false"/>
+                <w:bCs w:val="false"/>
+                <w:color w:val="222222"/>
+                <w:sz w:val="18"/>
+                <w:szCs w:val="18"/>
+              </w:rPr>
+              <w:t xml:space="preserve">아이스크림 두 개 주세요</w:t>
+            </w:r>
+          </w:p>
+        </w:tc>
+        <w:tc>
+          <w:tcPr>
+            <w:tcW w:type="dxa" w:w="6160"/>
+            <w:tcBorders>
+              <w:top w:val="single" w:color="CCCCCC" w:sz="1"/>
+              <w:left w:val="single" w:color="CCCCCC" w:sz="1"/>
+              <w:bottom w:val="single" w:color="CCCCCC" w:sz="1"/>
+              <w:right w:val="single" w:color="CCCCCC" w:sz="1"/>
+            </w:tcBorders>
+            <w:shd w:fill="FFFFFF" w:val="clear"/>
+            <w:tcMar>
+              <w:top w:type="dxa" w:w="80"/>
+              <w:left w:type="dxa" w:w="120"/>
+              <w:bottom w:type="dxa" w:w="80"/>
+              <w:right w:type="dxa" w:w="120"/>
+            </w:tcMar>
+          </w:tcPr>
+          <w:p>
+            <w:r>
+              <w:rPr>
+                <w:rFonts w:ascii="Arial" w:cs="Arial" w:eastAsia="Arial" w:hAnsi="Arial"/>
+                <w:b w:val="false"/>
+                <w:bCs w:val="false"/>
+                <w:color w:val="222222"/>
+                <w:sz w:val="18"/>
+                <w:szCs w:val="18"/>
+              </w:rPr>
+              <w:t xml:space="preserve">N 주세요 / 개.잔.병</w:t>
+            </w:r>
+          </w:p>
+        </w:tc>
+      </w:tr>
+      <w:tr>
+        <w:trPr>
+          <w:tblHeader w:val="false"/>
+        </w:trPr>
+        <w:tc>
+          <w:tcPr>
+            <w:tcW w:type="dxa" w:w="700"/>
+            <w:tcBorders>
+              <w:top w:val="single" w:color="CCCCCC" w:sz="1"/>
+              <w:left w:val="single" w:color="CCCCCC" w:sz="1"/>
+              <w:bottom w:val="single" w:color="CCCCCC" w:sz="1"/>
+              <w:right w:val="single" w:color="CCCCCC" w:sz="1"/>
+            </w:tcBorders>
+            <w:shd w:fill="E8F5F3" w:val="clear"/>
+            <w:tcMar>
+              <w:top w:type="dxa" w:w="80"/>
+              <w:left w:type="dxa" w:w="120"/>
+              <w:bottom w:type="dxa" w:w="80"/>
+              <w:right w:type="dxa" w:w="120"/>
+            </w:tcMar>
+          </w:tcPr>
+          <w:p>
+            <w:r>
+              <w:rPr>
+                <w:rFonts w:ascii="Arial" w:cs="Arial" w:eastAsia="Arial" w:hAnsi="Arial"/>
+                <w:b w:val="false"/>
+                <w:bCs w:val="false"/>
+                <w:color w:val="222222"/>
+                <w:sz w:val="18"/>
+                <w:szCs w:val="18"/>
+              </w:rPr>
+              <w:t xml:space="preserve">03</w:t>
+            </w:r>
+          </w:p>
+        </w:tc>
+        <w:tc>
+          <w:tcPr>
+            <w:tcW w:type="dxa" w:w="2500"/>
+            <w:tcBorders>
+              <w:top w:val="single" w:color="CCCCCC" w:sz="1"/>
+              <w:left w:val="single" w:color="CCCCCC" w:sz="1"/>
+              <w:bottom w:val="single" w:color="CCCCCC" w:sz="1"/>
+              <w:right w:val="single" w:color="CCCCCC" w:sz="1"/>
+            </w:tcBorders>
+            <w:shd w:fill="FFFFFF" w:val="clear"/>
+            <w:tcMar>
+              <w:top w:type="dxa" w:w="80"/>
+              <w:left w:type="dxa" w:w="120"/>
+              <w:bottom w:type="dxa" w:w="80"/>
+              <w:right w:type="dxa" w:w="120"/>
+            </w:tcMar>
+          </w:tcPr>
+          <w:p>
+            <w:r>
+              <w:rPr>
+                <w:rFonts w:ascii="Arial" w:cs="Arial" w:eastAsia="Arial" w:hAnsi="Arial"/>
+                <w:b w:val="false"/>
+                <w:bCs w:val="false"/>
+                <w:color w:val="222222"/>
+                <w:sz w:val="18"/>
+                <w:szCs w:val="18"/>
+              </w:rPr>
+              <w:t xml:space="preserve">마법 열쇠를 찾아라</w:t>
+            </w:r>
+          </w:p>
+        </w:tc>
+        <w:tc>
+          <w:tcPr>
+            <w:tcW w:type="dxa" w:w="6160"/>
+            <w:tcBorders>
+              <w:top w:val="single" w:color="CCCCCC" w:sz="1"/>
+              <w:left w:val="single" w:color="CCCCCC" w:sz="1"/>
+              <w:bottom w:val="single" w:color="CCCCCC" w:sz="1"/>
+              <w:right w:val="single" w:color="CCCCCC" w:sz="1"/>
+            </w:tcBorders>
+            <w:shd w:fill="FFFFFF" w:val="clear"/>
+            <w:tcMar>
+              <w:top w:type="dxa" w:w="80"/>
+              <w:left w:type="dxa" w:w="120"/>
+              <w:bottom w:type="dxa" w:w="80"/>
+              <w:right w:type="dxa" w:w="120"/>
+            </w:tcMar>
+          </w:tcPr>
+          <w:p>
+            <w:r>
+              <w:rPr>
+                <w:rFonts w:ascii="Arial" w:cs="Arial" w:eastAsia="Arial" w:hAnsi="Arial"/>
+                <w:b w:val="false"/>
+                <w:bCs w:val="false"/>
+                <w:color w:val="222222"/>
+                <w:sz w:val="18"/>
+                <w:szCs w:val="18"/>
+              </w:rPr>
+              <w:t xml:space="preserve">안+동사 / 위치명사+에 있어요/없어요</w:t>
+            </w:r>
+          </w:p>
+        </w:tc>
+      </w:tr>
+      <w:tr>
+        <w:trPr>
+          <w:tblHeader w:val="false"/>
+        </w:trPr>
+        <w:tc>
+          <w:tcPr>
+            <w:tcW w:type="dxa" w:w="700"/>
+            <w:tcBorders>
+              <w:top w:val="single" w:color="CCCCCC" w:sz="1"/>
+              <w:left w:val="single" w:color="CCCCCC" w:sz="1"/>
+              <w:bottom w:val="single" w:color="CCCCCC" w:sz="1"/>
+              <w:right w:val="single" w:color="CCCCCC" w:sz="1"/>
+            </w:tcBorders>
+            <w:shd w:fill="E8F5F3" w:val="clear"/>
+            <w:tcMar>
+              <w:top w:type="dxa" w:w="80"/>
+              <w:left w:type="dxa" w:w="120"/>
+              <w:bottom w:type="dxa" w:w="80"/>
+              <w:right w:type="dxa" w:w="120"/>
+            </w:tcMar>
+          </w:tcPr>
+          <w:p>
+            <w:r>
+              <w:rPr>
+                <w:rFonts w:ascii="Arial" w:cs="Arial" w:eastAsia="Arial" w:hAnsi="Arial"/>
+                <w:b w:val="false"/>
+                <w:bCs w:val="false"/>
+                <w:color w:val="222222"/>
+                <w:sz w:val="18"/>
+                <w:szCs w:val="18"/>
+              </w:rPr>
+              <w:t xml:space="preserve">04</w:t>
+            </w:r>
+          </w:p>
+        </w:tc>
+        <w:tc>
+          <w:tcPr>
+            <w:tcW w:type="dxa" w:w="2500"/>
+            <w:tcBorders>
+              <w:top w:val="single" w:color="CCCCCC" w:sz="1"/>
+              <w:left w:val="single" w:color="CCCCCC" w:sz="1"/>
+              <w:bottom w:val="single" w:color="CCCCCC" w:sz="1"/>
+              <w:right w:val="single" w:color="CCCCCC" w:sz="1"/>
+            </w:tcBorders>
+            <w:shd w:fill="FFFFFF" w:val="clear"/>
+            <w:tcMar>
+              <w:top w:type="dxa" w:w="80"/>
+              <w:left w:type="dxa" w:w="120"/>
+              <w:bottom w:type="dxa" w:w="80"/>
+              <w:right w:type="dxa" w:w="120"/>
+            </w:tcMar>
+          </w:tcPr>
+          <w:p>
+            <w:r>
+              <w:rPr>
+                <w:rFonts w:ascii="Arial" w:cs="Arial" w:eastAsia="Arial" w:hAnsi="Arial"/>
+                <w:b w:val="false"/>
+                <w:bCs w:val="false"/>
+                <w:color w:val="222222"/>
+                <w:sz w:val="18"/>
+                <w:szCs w:val="18"/>
+              </w:rPr>
+              <w:t xml:space="preserve">토요일에 결승전이 있어요</w:t>
+            </w:r>
+          </w:p>
+        </w:tc>
+        <w:tc>
+          <w:tcPr>
+            <w:tcW w:type="dxa" w:w="6160"/>
+            <w:tcBorders>
+              <w:top w:val="single" w:color="CCCCCC" w:sz="1"/>
+              <w:left w:val="single" w:color="CCCCCC" w:sz="1"/>
+              <w:bottom w:val="single" w:color="CCCCCC" w:sz="1"/>
+              <w:right w:val="single" w:color="CCCCCC" w:sz="1"/>
+            </w:tcBorders>
+            <w:shd w:fill="FFFFFF" w:val="clear"/>
+            <w:tcMar>
+              <w:top w:type="dxa" w:w="80"/>
+              <w:left w:type="dxa" w:w="120"/>
+              <w:bottom w:type="dxa" w:w="80"/>
+              <w:right w:type="dxa" w:w="120"/>
+            </w:tcMar>
+          </w:tcPr>
+          <w:p>
+            <w:r>
+              <w:rPr>
+                <w:rFonts w:ascii="Arial" w:cs="Arial" w:eastAsia="Arial" w:hAnsi="Arial"/>
+                <w:b w:val="false"/>
+                <w:bCs w:val="false"/>
+                <w:color w:val="222222"/>
+                <w:sz w:val="18"/>
+                <w:szCs w:val="18"/>
+              </w:rPr>
+              <w:t xml:space="preserve">-(으)ㄹ 거예요 / 요일+에 / -고 싶어요</w:t>
+            </w:r>
+          </w:p>
+        </w:tc>
+      </w:tr>
+      <w:tr>
+        <w:trPr>
+          <w:tblHeader w:val="false"/>
+        </w:trPr>
+        <w:tc>
+          <w:tcPr>
+            <w:tcW w:type="dxa" w:w="700"/>
+            <w:tcBorders>
+              <w:top w:val="single" w:color="CCCCCC" w:sz="1"/>
+              <w:left w:val="single" w:color="CCCCCC" w:sz="1"/>
+              <w:bottom w:val="single" w:color="CCCCCC" w:sz="1"/>
+              <w:right w:val="single" w:color="CCCCCC" w:sz="1"/>
+            </w:tcBorders>
+            <w:shd w:fill="E8F5F3" w:val="clear"/>
+            <w:tcMar>
+              <w:top w:type="dxa" w:w="80"/>
+              <w:left w:type="dxa" w:w="120"/>
+              <w:bottom w:type="dxa" w:w="80"/>
+              <w:right w:type="dxa" w:w="120"/>
+            </w:tcMar>
+          </w:tcPr>
+          <w:p>
+            <w:r>
+              <w:rPr>
+                <w:rFonts w:ascii="Arial" w:cs="Arial" w:eastAsia="Arial" w:hAnsi="Arial"/>
+                <w:b w:val="false"/>
+                <w:bCs w:val="false"/>
+                <w:color w:val="222222"/>
+                <w:sz w:val="18"/>
+                <w:szCs w:val="18"/>
+              </w:rPr>
+              <w:t xml:space="preserve">05</w:t>
+            </w:r>
+          </w:p>
+        </w:tc>
+        <w:tc>
+          <w:tcPr>
+            <w:tcW w:type="dxa" w:w="2500"/>
+            <w:tcBorders>
+              <w:top w:val="single" w:color="CCCCCC" w:sz="1"/>
+              <w:left w:val="single" w:color="CCCCCC" w:sz="1"/>
+              <w:bottom w:val="single" w:color="CCCCCC" w:sz="1"/>
+              <w:right w:val="single" w:color="CCCCCC" w:sz="1"/>
+            </w:tcBorders>
+            <w:shd w:fill="FFFFFF" w:val="clear"/>
+            <w:tcMar>
+              <w:top w:type="dxa" w:w="80"/>
+              <w:left w:type="dxa" w:w="120"/>
+              <w:bottom w:type="dxa" w:w="80"/>
+              <w:right w:type="dxa" w:w="120"/>
+            </w:tcMar>
+          </w:tcPr>
+          <w:p>
+            <w:r>
+              <w:rPr>
+                <w:rFonts w:ascii="Arial" w:cs="Arial" w:eastAsia="Arial" w:hAnsi="Arial"/>
+                <w:b w:val="false"/>
+                <w:bCs w:val="false"/>
+                <w:color w:val="222222"/>
+                <w:sz w:val="18"/>
+                <w:szCs w:val="18"/>
+              </w:rPr>
+              <w:t xml:space="preserve">레모네이드를 팔 거예요</w:t>
+            </w:r>
+          </w:p>
+        </w:tc>
+        <w:tc>
+          <w:tcPr>
+            <w:tcW w:type="dxa" w:w="6160"/>
+            <w:tcBorders>
+              <w:top w:val="single" w:color="CCCCCC" w:sz="1"/>
+              <w:left w:val="single" w:color="CCCCCC" w:sz="1"/>
+              <w:bottom w:val="single" w:color="CCCCCC" w:sz="1"/>
+              <w:right w:val="single" w:color="CCCCCC" w:sz="1"/>
+            </w:tcBorders>
+            <w:shd w:fill="FFFFFF" w:val="clear"/>
+            <w:tcMar>
+              <w:top w:type="dxa" w:w="80"/>
+              <w:left w:type="dxa" w:w="120"/>
+              <w:bottom w:type="dxa" w:w="80"/>
+              <w:right w:type="dxa" w:w="120"/>
+            </w:tcMar>
+          </w:tcPr>
+          <w:p>
+            <w:r>
+              <w:rPr>
+                <w:rFonts w:ascii="Arial" w:cs="Arial" w:eastAsia="Arial" w:hAnsi="Arial"/>
+                <w:b w:val="false"/>
+                <w:bCs w:val="false"/>
+                <w:color w:val="222222"/>
+                <w:sz w:val="18"/>
+                <w:szCs w:val="18"/>
+              </w:rPr>
+              <w:t xml:space="preserve">-았/었어요 (과거) / -(으)ㄹ 거예요 / -(으)ㄹ 수 있어요</w:t>
+            </w:r>
+          </w:p>
+        </w:tc>
+      </w:tr>
+      <w:tr>
+        <w:trPr>
+          <w:tblHeader w:val="false"/>
+        </w:trPr>
+        <w:tc>
+          <w:tcPr>
+            <w:tcW w:type="dxa" w:w="700"/>
+            <w:tcBorders>
+              <w:top w:val="single" w:color="CCCCCC" w:sz="1"/>
+              <w:left w:val="single" w:color="CCCCCC" w:sz="1"/>
+              <w:bottom w:val="single" w:color="CCCCCC" w:sz="1"/>
+              <w:right w:val="single" w:color="CCCCCC" w:sz="1"/>
+            </w:tcBorders>
+            <w:shd w:fill="E8F5F3" w:val="clear"/>
+            <w:tcMar>
+              <w:top w:type="dxa" w:w="80"/>
+              <w:left w:type="dxa" w:w="120"/>
+              <w:bottom w:type="dxa" w:w="80"/>
+              <w:right w:type="dxa" w:w="120"/>
+            </w:tcMar>
+          </w:tcPr>
+          <w:p>
+            <w:r>
+              <w:rPr>
+                <w:rFonts w:ascii="Arial" w:cs="Arial" w:eastAsia="Arial" w:hAnsi="Arial"/>
+                <w:b w:val="false"/>
+                <w:bCs w:val="false"/>
+                <w:color w:val="222222"/>
+                <w:sz w:val="18"/>
+                <w:szCs w:val="18"/>
+              </w:rPr>
+              <w:t xml:space="preserve">06</w:t>
+            </w:r>
+          </w:p>
+        </w:tc>
+        <w:tc>
+          <w:tcPr>
+            <w:tcW w:type="dxa" w:w="2500"/>
+            <w:tcBorders>
+              <w:top w:val="single" w:color="CCCCCC" w:sz="1"/>
+              <w:left w:val="single" w:color="CCCCCC" w:sz="1"/>
+              <w:bottom w:val="single" w:color="CCCCCC" w:sz="1"/>
+              <w:right w:val="single" w:color="CCCCCC" w:sz="1"/>
+            </w:tcBorders>
+            <w:shd w:fill="FFFFFF" w:val="clear"/>
+            <w:tcMar>
+              <w:top w:type="dxa" w:w="80"/>
+              <w:left w:type="dxa" w:w="120"/>
+              <w:bottom w:type="dxa" w:w="80"/>
+              <w:right w:type="dxa" w:w="120"/>
+            </w:tcMar>
+          </w:tcPr>
+          <w:p>
+            <w:r>
+              <w:rPr>
+                <w:rFonts w:ascii="Arial" w:cs="Arial" w:eastAsia="Arial" w:hAnsi="Arial"/>
+                <w:b w:val="false"/>
+                <w:bCs w:val="false"/>
+                <w:color w:val="222222"/>
+                <w:sz w:val="18"/>
+                <w:szCs w:val="18"/>
+              </w:rPr>
+              <w:t xml:space="preserve">계란은 못 먹어요</w:t>
+            </w:r>
+          </w:p>
+        </w:tc>
+        <w:tc>
+          <w:tcPr>
+            <w:tcW w:type="dxa" w:w="6160"/>
+            <w:tcBorders>
+              <w:top w:val="single" w:color="CCCCCC" w:sz="1"/>
+              <w:left w:val="single" w:color="CCCCCC" w:sz="1"/>
+              <w:bottom w:val="single" w:color="CCCCCC" w:sz="1"/>
+              <w:right w:val="single" w:color="CCCCCC" w:sz="1"/>
+            </w:tcBorders>
+            <w:shd w:fill="FFFFFF" w:val="clear"/>
+            <w:tcMar>
+              <w:top w:type="dxa" w:w="80"/>
+              <w:left w:type="dxa" w:w="120"/>
+              <w:bottom w:type="dxa" w:w="80"/>
+              <w:right w:type="dxa" w:w="120"/>
+            </w:tcMar>
+          </w:tcPr>
+          <w:p>
+            <w:r>
+              <w:rPr>
+                <w:rFonts w:ascii="Arial" w:cs="Arial" w:eastAsia="Arial" w:hAnsi="Arial"/>
+                <w:b w:val="false"/>
+                <w:bCs w:val="false"/>
+                <w:color w:val="222222"/>
+                <w:sz w:val="18"/>
+                <w:szCs w:val="18"/>
+              </w:rPr>
+              <w:t xml:space="preserve">못+동사 / -지 마세요 / -(으)면 안 돼요 / -(으)면</w:t>
+            </w:r>
+          </w:p>
+        </w:tc>
+      </w:tr>
+      <w:tr>
+        <w:trPr>
+          <w:tblHeader w:val="false"/>
+        </w:trPr>
+        <w:tc>
+          <w:tcPr>
+            <w:tcW w:type="dxa" w:w="700"/>
+            <w:tcBorders>
+              <w:top w:val="single" w:color="CCCCCC" w:sz="1"/>
+              <w:left w:val="single" w:color="CCCCCC" w:sz="1"/>
+              <w:bottom w:val="single" w:color="CCCCCC" w:sz="1"/>
+              <w:right w:val="single" w:color="CCCCCC" w:sz="1"/>
+            </w:tcBorders>
+            <w:shd w:fill="E8F5F3" w:val="clear"/>
+            <w:tcMar>
+              <w:top w:type="dxa" w:w="80"/>
+              <w:left w:type="dxa" w:w="120"/>
+              <w:bottom w:type="dxa" w:w="80"/>
+              <w:right w:type="dxa" w:w="120"/>
+            </w:tcMar>
+          </w:tcPr>
+          <w:p>
+            <w:r>
+              <w:rPr>
+                <w:rFonts w:ascii="Arial" w:cs="Arial" w:eastAsia="Arial" w:hAnsi="Arial"/>
+                <w:b w:val="false"/>
+                <w:bCs w:val="false"/>
+                <w:color w:val="222222"/>
+                <w:sz w:val="18"/>
+                <w:szCs w:val="18"/>
+              </w:rPr>
+              <w:t xml:space="preserve">07</w:t>
+            </w:r>
+          </w:p>
+        </w:tc>
+        <w:tc>
+          <w:tcPr>
+            <w:tcW w:type="dxa" w:w="2500"/>
+            <w:tcBorders>
+              <w:top w:val="single" w:color="CCCCCC" w:sz="1"/>
+              <w:left w:val="single" w:color="CCCCCC" w:sz="1"/>
+              <w:bottom w:val="single" w:color="CCCCCC" w:sz="1"/>
+              <w:right w:val="single" w:color="CCCCCC" w:sz="1"/>
+            </w:tcBorders>
+            <w:shd w:fill="FFFFFF" w:val="clear"/>
+            <w:tcMar>
+              <w:top w:type="dxa" w:w="80"/>
+              <w:left w:type="dxa" w:w="120"/>
+              <w:bottom w:type="dxa" w:w="80"/>
+              <w:right w:type="dxa" w:w="120"/>
+            </w:tcMar>
+          </w:tcPr>
+          <w:p>
+            <w:r>
+              <w:rPr>
+                <w:rFonts w:ascii="Arial" w:cs="Arial" w:eastAsia="Arial" w:hAnsi="Arial"/>
+                <w:b w:val="false"/>
+                <w:bCs w:val="false"/>
+                <w:color w:val="222222"/>
+                <w:sz w:val="18"/>
+                <w:szCs w:val="18"/>
+              </w:rPr>
+              <w:t xml:space="preserve">노을 보면서 라면 먹고 싶어요</w:t>
+            </w:r>
+          </w:p>
+        </w:tc>
+        <w:tc>
+          <w:tcPr>
+            <w:tcW w:type="dxa" w:w="6160"/>
+            <w:tcBorders>
+              <w:top w:val="single" w:color="CCCCCC" w:sz="1"/>
+              <w:left w:val="single" w:color="CCCCCC" w:sz="1"/>
+              <w:bottom w:val="single" w:color="CCCCCC" w:sz="1"/>
+              <w:right w:val="single" w:color="CCCCCC" w:sz="1"/>
+            </w:tcBorders>
+            <w:shd w:fill="FFFFFF" w:val="clear"/>
+            <w:tcMar>
+              <w:top w:type="dxa" w:w="80"/>
+              <w:left w:type="dxa" w:w="120"/>
+              <w:bottom w:type="dxa" w:w="80"/>
+              <w:right w:type="dxa" w:w="120"/>
+            </w:tcMar>
+          </w:tcPr>
+          <w:p>
+            <w:r>
+              <w:rPr>
+                <w:rFonts w:ascii="Arial" w:cs="Arial" w:eastAsia="Arial" w:hAnsi="Arial"/>
+                <w:b w:val="false"/>
+                <w:bCs w:val="false"/>
+                <w:color w:val="222222"/>
+                <w:sz w:val="18"/>
+                <w:szCs w:val="18"/>
+              </w:rPr>
+              <w:t xml:space="preserve">-고 싶어요 심화 / -아야/어야 해요 / -(으)면서</w:t>
+            </w:r>
+          </w:p>
+        </w:tc>
+      </w:tr>
+      <w:tr>
+        <w:trPr>
+          <w:tblHeader w:val="false"/>
+        </w:trPr>
+        <w:tc>
+          <w:tcPr>
+            <w:tcW w:type="dxa" w:w="700"/>
+            <w:tcBorders>
+              <w:top w:val="single" w:color="CCCCCC" w:sz="1"/>
+              <w:left w:val="single" w:color="CCCCCC" w:sz="1"/>
+              <w:bottom w:val="single" w:color="CCCCCC" w:sz="1"/>
+              <w:right w:val="single" w:color="CCCCCC" w:sz="1"/>
+            </w:tcBorders>
+            <w:shd w:fill="E8F5F3" w:val="clear"/>
+            <w:tcMar>
+              <w:top w:type="dxa" w:w="80"/>
+              <w:left w:type="dxa" w:w="120"/>
+              <w:bottom w:type="dxa" w:w="80"/>
+              <w:right w:type="dxa" w:w="120"/>
+            </w:tcMar>
+          </w:tcPr>
+          <w:p>
+            <w:r>
+              <w:rPr>
+                <w:rFonts w:ascii="Arial" w:cs="Arial" w:eastAsia="Arial" w:hAnsi="Arial"/>
+                <w:b w:val="false"/>
+                <w:bCs w:val="false"/>
+                <w:color w:val="222222"/>
+                <w:sz w:val="18"/>
+                <w:szCs w:val="18"/>
+              </w:rPr>
+              <w:t xml:space="preserve">08</w:t>
+            </w:r>
+          </w:p>
+        </w:tc>
+        <w:tc>
+          <w:tcPr>
+            <w:tcW w:type="dxa" w:w="2500"/>
+            <w:tcBorders>
+              <w:top w:val="single" w:color="CCCCCC" w:sz="1"/>
+              <w:left w:val="single" w:color="CCCCCC" w:sz="1"/>
+              <w:bottom w:val="single" w:color="CCCCCC" w:sz="1"/>
+              <w:right w:val="single" w:color="CCCCCC" w:sz="1"/>
+            </w:tcBorders>
+            <w:shd w:fill="FFFFFF" w:val="clear"/>
+            <w:tcMar>
+              <w:top w:type="dxa" w:w="80"/>
+              <w:left w:type="dxa" w:w="120"/>
+              <w:bottom w:type="dxa" w:w="80"/>
+              <w:right w:type="dxa" w:w="120"/>
+            </w:tcMar>
+          </w:tcPr>
+          <w:p>
+            <w:r>
+              <w:rPr>
+                <w:rFonts w:ascii="Arial" w:cs="Arial" w:eastAsia="Arial" w:hAnsi="Arial"/>
+                <w:b w:val="false"/>
+                <w:bCs w:val="false"/>
+                <w:color w:val="222222"/>
+                <w:sz w:val="18"/>
+                <w:szCs w:val="18"/>
+              </w:rPr>
+              <w:t xml:space="preserve">할 수 있다!</w:t>
+            </w:r>
+          </w:p>
+        </w:tc>
+        <w:tc>
+          <w:tcPr>
+            <w:tcW w:type="dxa" w:w="6160"/>
+            <w:tcBorders>
+              <w:top w:val="single" w:color="CCCCCC" w:sz="1"/>
+              <w:left w:val="single" w:color="CCCCCC" w:sz="1"/>
+              <w:bottom w:val="single" w:color="CCCCCC" w:sz="1"/>
+              <w:right w:val="single" w:color="CCCCCC" w:sz="1"/>
+            </w:tcBorders>
+            <w:shd w:fill="FFFFFF" w:val="clear"/>
+            <w:tcMar>
+              <w:top w:type="dxa" w:w="80"/>
+              <w:left w:type="dxa" w:w="120"/>
+              <w:bottom w:type="dxa" w:w="80"/>
+              <w:right w:type="dxa" w:w="120"/>
+            </w:tcMar>
+          </w:tcPr>
+          <w:p>
+            <w:r>
+              <w:rPr>
+                <w:rFonts w:ascii="Arial" w:cs="Arial" w:eastAsia="Arial" w:hAnsi="Arial"/>
+                <w:b w:val="false"/>
+                <w:bCs w:val="false"/>
+                <w:color w:val="222222"/>
+                <w:sz w:val="18"/>
+                <w:szCs w:val="18"/>
+              </w:rPr>
+              <w:t xml:space="preserve">더+형용사 (비교) / 제일+형용사 (최상급)</w:t>
+            </w:r>
+          </w:p>
+        </w:tc>
+      </w:tr>
+      <w:tr>
+        <w:trPr>
+          <w:tblHeader w:val="false"/>
+        </w:trPr>
+        <w:tc>
+          <w:tcPr>
+            <w:tcW w:type="dxa" w:w="700"/>
+            <w:tcBorders>
+              <w:top w:val="single" w:color="CCCCCC" w:sz="1"/>
+              <w:left w:val="single" w:color="CCCCCC" w:sz="1"/>
+              <w:bottom w:val="single" w:color="CCCCCC" w:sz="1"/>
+              <w:right w:val="single" w:color="CCCCCC" w:sz="1"/>
+            </w:tcBorders>
+            <w:shd w:fill="E8F5F3" w:val="clear"/>
+            <w:tcMar>
+              <w:top w:type="dxa" w:w="80"/>
+              <w:left w:type="dxa" w:w="120"/>
+              <w:bottom w:type="dxa" w:w="80"/>
+              <w:right w:type="dxa" w:w="120"/>
+            </w:tcMar>
+          </w:tcPr>
+          <w:p>
+            <w:r>
+              <w:rPr>
+                <w:rFonts w:ascii="Arial" w:cs="Arial" w:eastAsia="Arial" w:hAnsi="Arial"/>
+                <w:b w:val="false"/>
+                <w:bCs w:val="false"/>
+                <w:color w:val="222222"/>
+                <w:sz w:val="18"/>
+                <w:szCs w:val="18"/>
+              </w:rPr>
+              <w:t xml:space="preserve">09</w:t>
+            </w:r>
+          </w:p>
+        </w:tc>
+        <w:tc>
+          <w:tcPr>
+            <w:tcW w:type="dxa" w:w="2500"/>
+            <w:tcBorders>
+              <w:top w:val="single" w:color="CCCCCC" w:sz="1"/>
+              <w:left w:val="single" w:color="CCCCCC" w:sz="1"/>
+              <w:bottom w:val="single" w:color="CCCCCC" w:sz="1"/>
+              <w:right w:val="single" w:color="CCCCCC" w:sz="1"/>
+            </w:tcBorders>
+            <w:shd w:fill="FFFFFF" w:val="clear"/>
+            <w:tcMar>
+              <w:top w:type="dxa" w:w="80"/>
+              <w:left w:type="dxa" w:w="120"/>
+              <w:bottom w:type="dxa" w:w="80"/>
+              <w:right w:type="dxa" w:w="120"/>
+            </w:tcMar>
+          </w:tcPr>
+          <w:p>
+            <w:r>
+              <w:rPr>
+                <w:rFonts w:ascii="Arial" w:cs="Arial" w:eastAsia="Arial" w:hAnsi="Arial"/>
+                <w:b w:val="false"/>
+                <w:bCs w:val="false"/>
+                <w:color w:val="222222"/>
+                <w:sz w:val="18"/>
+                <w:szCs w:val="18"/>
+              </w:rPr>
+              <w:t xml:space="preserve">할아버지, 아직 멀었어요?</w:t>
+            </w:r>
+          </w:p>
+        </w:tc>
+        <w:tc>
+          <w:tcPr>
+            <w:tcW w:type="dxa" w:w="6160"/>
+            <w:tcBorders>
+              <w:top w:val="single" w:color="CCCCCC" w:sz="1"/>
+              <w:left w:val="single" w:color="CCCCCC" w:sz="1"/>
+              <w:bottom w:val="single" w:color="CCCCCC" w:sz="1"/>
+              <w:right w:val="single" w:color="CCCCCC" w:sz="1"/>
+            </w:tcBorders>
+            <w:shd w:fill="FFFFFF" w:val="clear"/>
+            <w:tcMar>
+              <w:top w:type="dxa" w:w="80"/>
+              <w:left w:type="dxa" w:w="120"/>
+              <w:bottom w:type="dxa" w:w="80"/>
+              <w:right w:type="dxa" w:w="120"/>
+            </w:tcMar>
+          </w:tcPr>
+          <w:p>
+            <w:r>
+              <w:rPr>
+                <w:rFonts w:ascii="Arial" w:cs="Arial" w:eastAsia="Arial" w:hAnsi="Arial"/>
+                <w:b w:val="false"/>
+                <w:bCs w:val="false"/>
+                <w:color w:val="222222"/>
+                <w:sz w:val="18"/>
+                <w:szCs w:val="18"/>
+              </w:rPr>
+              <w:t xml:space="preserve">에/에서 / 부터~까지 / 걸리다.남다</w:t>
+            </w:r>
+          </w:p>
+        </w:tc>
+      </w:tr>
+      <w:tr>
+        <w:trPr>
+          <w:tblHeader w:val="false"/>
+        </w:trPr>
+        <w:tc>
+          <w:tcPr>
+            <w:tcW w:type="dxa" w:w="700"/>
+            <w:tcBorders>
+              <w:top w:val="single" w:color="CCCCCC" w:sz="1"/>
+              <w:left w:val="single" w:color="CCCCCC" w:sz="1"/>
+              <w:bottom w:val="single" w:color="CCCCCC" w:sz="1"/>
+              <w:right w:val="single" w:color="CCCCCC" w:sz="1"/>
+            </w:tcBorders>
+            <w:shd w:fill="E8F5F3" w:val="clear"/>
+            <w:tcMar>
+              <w:top w:type="dxa" w:w="80"/>
+              <w:left w:type="dxa" w:w="120"/>
+              <w:bottom w:type="dxa" w:w="80"/>
+              <w:right w:type="dxa" w:w="120"/>
+            </w:tcMar>
+          </w:tcPr>
+          <w:p>
+            <w:r>
+              <w:rPr>
+                <w:rFonts w:ascii="Arial" w:cs="Arial" w:eastAsia="Arial" w:hAnsi="Arial"/>
+                <w:b w:val="false"/>
+                <w:bCs w:val="false"/>
+                <w:color w:val="222222"/>
+                <w:sz w:val="18"/>
+                <w:szCs w:val="18"/>
+              </w:rPr>
+              <w:t xml:space="preserve">10</w:t>
+            </w:r>
+          </w:p>
+        </w:tc>
+        <w:tc>
+          <w:tcPr>
+            <w:tcW w:type="dxa" w:w="2500"/>
+            <w:tcBorders>
+              <w:top w:val="single" w:color="CCCCCC" w:sz="1"/>
+              <w:left w:val="single" w:color="CCCCCC" w:sz="1"/>
+              <w:bottom w:val="single" w:color="CCCCCC" w:sz="1"/>
+              <w:right w:val="single" w:color="CCCCCC" w:sz="1"/>
+            </w:tcBorders>
+            <w:shd w:fill="FFFFFF" w:val="clear"/>
+            <w:tcMar>
+              <w:top w:type="dxa" w:w="80"/>
+              <w:left w:type="dxa" w:w="120"/>
+              <w:bottom w:type="dxa" w:w="80"/>
+              <w:right w:type="dxa" w:w="120"/>
+            </w:tcMar>
+          </w:tcPr>
+          <w:p>
+            <w:r>
+              <w:rPr>
+                <w:rFonts w:ascii="Arial" w:cs="Arial" w:eastAsia="Arial" w:hAnsi="Arial"/>
+                <w:b w:val="false"/>
+                <w:bCs w:val="false"/>
+                <w:color w:val="222222"/>
+                <w:sz w:val="18"/>
+                <w:szCs w:val="18"/>
+              </w:rPr>
+              <w:t xml:space="preserve">엄마한테 물어 봐</w:t>
+            </w:r>
+          </w:p>
+        </w:tc>
+        <w:tc>
+          <w:tcPr>
+            <w:tcW w:type="dxa" w:w="6160"/>
+            <w:tcBorders>
+              <w:top w:val="single" w:color="CCCCCC" w:sz="1"/>
+              <w:left w:val="single" w:color="CCCCCC" w:sz="1"/>
+              <w:bottom w:val="single" w:color="CCCCCC" w:sz="1"/>
+              <w:right w:val="single" w:color="CCCCCC" w:sz="1"/>
+            </w:tcBorders>
+            <w:shd w:fill="FFFFFF" w:val="clear"/>
+            <w:tcMar>
+              <w:top w:type="dxa" w:w="80"/>
+              <w:left w:type="dxa" w:w="120"/>
+              <w:bottom w:type="dxa" w:w="80"/>
+              <w:right w:type="dxa" w:w="120"/>
+            </w:tcMar>
+          </w:tcPr>
+          <w:p>
+            <w:r>
+              <w:rPr>
+                <w:rFonts w:ascii="Arial" w:cs="Arial" w:eastAsia="Arial" w:hAnsi="Arial"/>
+                <w:b w:val="false"/>
+                <w:bCs w:val="false"/>
+                <w:color w:val="222222"/>
+                <w:sz w:val="18"/>
+                <w:szCs w:val="18"/>
+              </w:rPr>
+              <w:t xml:space="preserve">~도 돼요? (허락) / 한테.한테서 / 왜.어떻게</w:t>
+            </w:r>
+          </w:p>
+        </w:tc>
+      </w:tr>
+    </w:tbl>
+    <w:p>
+      <w:pPr>
+        <w:spacing w:after="160"/>
+      </w:pPr>
+    </w:p>
+    <w:p>
+      <w:pPr>
+        <w:pStyle w:val="Heading2"/>
+      </w:pPr>
+      <w:r>
+        <w:rPr>
+          <w:rFonts w:ascii="Arial" w:cs="Arial" w:eastAsia="Arial" w:hAnsi="Arial"/>
+          <w:b/>
+          <w:bCs/>
+          <w:color w:val="1C3A5E"/>
+        </w:rPr>
+        <w:t xml:space="preserve">Kids Level 4  unit01~04 완성 — 진행형 + 연결 + 보조동사</w:t>
+      </w:r>
     </w:p>
     <w:tbl>
       <w:tblPr>
@@ -7321,7 +10565,7 @@
                 <w:sz w:val="18"/>
                 <w:szCs w:val="18"/>
               </w:rPr>
-              <w:t xml:space="preserve">그래서/그런데/그리고 (접속부사) / -지만 / -고 있었어요</w:t>
+              <w:t xml:space="preserve">그래서/그런데/그리고 / -지만 / -고 있었어요 (과거진행)</w:t>
             </w:r>
           </w:p>
         </w:tc>
@@ -7487,6 +10731,23 @@
         </w:tc>
       </w:tr>
     </w:tbl>
+    <w:p>
+      <w:pPr>
+        <w:spacing w:after="60" w:before="60"/>
+        <w:ind w:left="200"/>
+      </w:pPr>
+      <w:r>
+        <w:rPr>
+          <w:rFonts w:ascii="Arial" w:cs="Arial" w:eastAsia="Arial" w:hAnsi="Arial"/>
+          <w:i/>
+          <w:iCs/>
+          <w:color w:val="555555"/>
+          <w:sz w:val="17"/>
+          <w:szCs w:val="17"/>
+        </w:rPr>
+        <w:t xml:space="preserve">unit05+ 후보: -(으)면 조건 / -(이)라서 이유 / -아/어야 해요 심화 / -고 싶어요 복습 / -는 것 같아요</w:t>
+      </w:r>
+    </w:p>
     <w:p>
       <w:pPr>
         <w:spacing w:after="160"/>

</xml_diff>